<commit_message>
Publish verified Android executable and illustrated studio guide
</commit_message>
<xml_diff>
--- a/docs/releases/Honorable-Creative-Guide.docx
+++ b/docs/releases/Honorable-Creative-Guide.docx
@@ -7,61 +7,164 @@
         <w:pStyle w:val="Title"/>
       </w:pPr>
       <w:r>
-        <w:t>What you can make with Honorable</w:t>
+        <w:t>Honorable app update</w:t>
       </w:r>
     </w:p>
     <w:p>
       <w:r>
-        <w:t>Honorable has grown from a photo and video search project into an app with local editing and creation tools. We kept the original search foundation and built on it. You can now shape a video, finish a photo or start a drawing without setting up an account.</w:t>
+        <w:t>A visual guide to the Home redesign, the editing studios and what you can make with the app.</w:t>
       </w:r>
     </w:p>
     <w:p>
       <w:r>
-        <w:t>This update explains what we added, how the app differs from the oldest version, and what you could make with it. The Android build has passed automated checks. It still needs testing on a real phone before we can call it ready for everyone.</w:t>
+        <w:t>We kept the original search foundation and continued building the same app. This update replaces the earlier text-heavy report with screen images, direct comparisons and a detailed feature guide. The new Home and offline launch screen are in app source and a freshly built Android candidate.</w:t>
       </w:r>
     </w:p>
-    <w:p>
-      <w:pPr>
-        <w:pStyle w:val="Heading1"/>
-      </w:pPr>
-      <w:r>
-        <w:t>Two new ways to finish a video</w:t>
-      </w:r>
-    </w:p>
+    <w:tbl>
+      <w:tblPr>
+        <w:tblW w:type="auto" w:w="0"/>
+        <w:tblLayout w:type="fixed"/>
+        <w:tblLook w:firstColumn="1" w:firstRow="1" w:lastColumn="0" w:lastRow="0" w:noHBand="0" w:noVBand="1" w:val="04A0"/>
+      </w:tblPr>
+      <w:tblGrid>
+        <w:gridCol w:w="5040"/>
+        <w:gridCol w:w="5040"/>
+      </w:tblGrid>
+      <w:tr>
+        <w:trPr>
+          <w:cantSplit/>
+        </w:trPr>
+        <w:tc>
+          <w:tcPr>
+            <w:tcW w:type="dxa" w:w="4968"/>
+          </w:tcPr>
+          <w:p>
+            <w:pPr>
+              <w:spacing w:after="60"/>
+              <w:jc w:val="center"/>
+            </w:pPr>
+            <w:r>
+              <w:drawing>
+                <wp:inline xmlns:a="http://schemas.openxmlformats.org/drawingml/2006/main" xmlns:pic="http://schemas.openxmlformats.org/drawingml/2006/picture">
+                  <wp:extent cx="2029968" cy="4381002"/>
+                  <wp:docPr id="1" name="Picture 1"/>
+                  <wp:cNvGraphicFramePr>
+                    <a:graphicFrameLocks noChangeAspect="1"/>
+                  </wp:cNvGraphicFramePr>
+                  <a:graphic>
+                    <a:graphicData uri="http://schemas.openxmlformats.org/drawingml/2006/picture">
+                      <pic:pic>
+                        <pic:nvPicPr>
+                          <pic:cNvPr id="0" name="current-home.png"/>
+                          <pic:cNvPicPr/>
+                        </pic:nvPicPr>
+                        <pic:blipFill>
+                          <a:blip r:embed="rId11"/>
+                          <a:stretch>
+                            <a:fillRect/>
+                          </a:stretch>
+                        </pic:blipFill>
+                        <pic:spPr>
+                          <a:xfrm>
+                            <a:off x="0" y="0"/>
+                            <a:ext cx="2029968" cy="4381002"/>
+                          </a:xfrm>
+                          <a:prstGeom prst="rect"/>
+                        </pic:spPr>
+                      </pic:pic>
+                    </a:graphicData>
+                  </a:graphic>
+                </wp:inline>
+              </w:drawing>
+            </w:r>
+          </w:p>
+        </w:tc>
+        <w:tc>
+          <w:tcPr>
+            <w:tcW w:type="dxa" w:w="4968"/>
+          </w:tcPr>
+          <w:p>
+            <w:pPr>
+              <w:spacing w:after="60"/>
+              <w:jc w:val="center"/>
+            </w:pPr>
+            <w:r>
+              <w:drawing>
+                <wp:inline xmlns:a="http://schemas.openxmlformats.org/drawingml/2006/main" xmlns:pic="http://schemas.openxmlformats.org/drawingml/2006/picture">
+                  <wp:extent cx="2029968" cy="4381002"/>
+                  <wp:docPr id="2" name="Picture 2"/>
+                  <wp:cNvGraphicFramePr>
+                    <a:graphicFrameLocks noChangeAspect="1"/>
+                  </wp:cNvGraphicFramePr>
+                  <a:graphic>
+                    <a:graphicData uri="http://schemas.openxmlformats.org/drawingml/2006/picture">
+                      <pic:pic>
+                        <pic:nvPicPr>
+                          <pic:cNvPr id="0" name="current-videoWorkspace.png"/>
+                          <pic:cNvPicPr/>
+                        </pic:nvPicPr>
+                        <pic:blipFill>
+                          <a:blip r:embed="rId12"/>
+                          <a:stretch>
+                            <a:fillRect/>
+                          </a:stretch>
+                        </pic:blipFill>
+                        <pic:spPr>
+                          <a:xfrm>
+                            <a:off x="0" y="0"/>
+                            <a:ext cx="2029968" cy="4381002"/>
+                          </a:xfrm>
+                          <a:prstGeom prst="rect"/>
+                        </pic:spPr>
+                      </pic:pic>
+                    </a:graphicData>
+                  </a:graphic>
+                </wp:inline>
+              </w:drawing>
+            </w:r>
+          </w:p>
+        </w:tc>
+      </w:tr>
+      <w:tr>
+        <w:trPr>
+          <w:cantSplit/>
+        </w:trPr>
+        <w:tc>
+          <w:tcPr>
+            <w:tcW w:type="dxa" w:w="4968"/>
+          </w:tcPr>
+          <w:p>
+            <w:pPr>
+              <w:pStyle w:val="Caption"/>
+              <w:jc w:val="center"/>
+            </w:pPr>
+            <w:r>
+              <w:t>New Home · actual React Native component adapted to HTML</w:t>
+            </w:r>
+          </w:p>
+        </w:tc>
+        <w:tc>
+          <w:tcPr>
+            <w:tcW w:type="dxa" w:w="4968"/>
+          </w:tcPr>
+          <w:p>
+            <w:pPr>
+              <w:pStyle w:val="Caption"/>
+              <w:jc w:val="center"/>
+            </w:pPr>
+            <w:r>
+              <w:t>Video studio · native source illustration with sample media</w:t>
+            </w:r>
+          </w:p>
+        </w:tc>
+      </w:tr>
+    </w:tbl>
     <w:p>
       <w:pPr>
         <w:pStyle w:val="Heading2"/>
       </w:pPr>
       <w:r>
-        <w:t>Make a short montage from a longer timeline</w:t>
-      </w:r>
-    </w:p>
-    <w:p>
-      <w:r>
-        <w:t>Add your videos, put them in the order you want, then choose Build a montage. Pick 15, 30 or 60 seconds. Honorable takes balanced excerpts from the middle of the clips and shows the proposed length before you apply it. Short footage stays short; the tool does not loop or invent footage to fill the target.</w:t>
-      </w:r>
-    </w:p>
-    <w:p>
-      <w:r>
-        <w:t>Your color edits, speed, titles, visible captions and soundtrack stay attached. The result opens in the existing preview and export pipeline. You can keep editing, or undo the montage in one step. This is a fast local editing recipe, separate from the existing experimental AI rough cut.</w:t>
-      </w:r>
-    </w:p>
-    <w:p>
-      <w:pPr>
-        <w:pStyle w:val="Heading2"/>
-      </w:pPr>
-      <w:r>
-        <w:t>Turn your own script into editable captions</w:t>
-      </w:r>
-    </w:p>
-    <w:p>
-      <w:r>
-        <w:t>Paste one line per caption. Honorable distributes the lines across the selected clip, giving longer lines more time, and lets you review the proposal. Apply it to replace that clip’s captions, then adjust individual cues in Captions. Undo brings the previous captions back.</w:t>
-      </w:r>
-    </w:p>
-    <w:p>
-      <w:r>
-        <w:t>This is useful for a product explanation, a short tutorial or a video made to watch without sound. The timing is estimated from your text. It does not listen to speech or generate a transcript.</w:t>
+        <w:t>What changed in this update</w:t>
       </w:r>
     </w:p>
     <w:p>
@@ -72,10 +175,38 @@
         <w:rPr>
           <w:b/>
         </w:rPr>
-        <w:t xml:space="preserve">New in this increment  </w:t>
+        <w:t xml:space="preserve">A new front door  </w:t>
       </w:r>
       <w:r>
-        <w:t>Two video workflows and ten focused Android regression tests. No new AI model or generative engine. These tools are available in the local guest editor too.</w:t>
+        <w:t>Home now puts Photo studio and Video studio beside each other. Seran search and the real media library remain below. Offline guests get four clear starting points.</w:t>
+      </w:r>
+    </w:p>
+    <w:p>
+      <w:pPr>
+        <w:keepLines/>
+      </w:pPr>
+      <w:r>
+        <w:rPr>
+          <w:b/>
+        </w:rPr>
+        <w:t xml:space="preserve">A complete preview  </w:t>
+      </w:r>
+      <w:r>
+        <w:t>Explore 18 states, including both editors, their inspector panels, drawing, montage review and script captions. The preview file works offline.</w:t>
+      </w:r>
+    </w:p>
+    <w:p>
+      <w:pPr>
+        <w:keepLines/>
+      </w:pPr>
+      <w:r>
+        <w:rPr>
+          <w:b/>
+        </w:rPr>
+        <w:t xml:space="preserve">The honest release status  </w:t>
+      </w:r>
+      <w:r>
+        <w:t>The Android candidate passed automated checks. It still needs a real phone test. iOS editing and generative image or video tools are unfinished.</w:t>
       </w:r>
     </w:p>
     <w:p>
@@ -88,74 +219,522 @@
         <w:pStyle w:val="Heading1"/>
       </w:pPr>
       <w:r>
-        <w:t>Photos and drawings</w:t>
+        <w:t>Home before and after</w:t>
       </w:r>
     </w:p>
     <w:p>
       <w:r>
-        <w:t>You can start with an existing photo, a blank canvas or a drawing. The tools below are implemented in the Android app; their saved output and touch behavior still need physical-device acceptance.</w:t>
+        <w:t>The comparison below uses the previous shared preview and today’s actual React Native component capture. Both use the same sample media. Neither is a native phone screenshot.</w:t>
+      </w:r>
+    </w:p>
+    <w:tbl>
+      <w:tblPr>
+        <w:tblW w:type="auto" w:w="0"/>
+        <w:tblLayout w:type="fixed"/>
+        <w:tblLook w:firstColumn="1" w:firstRow="1" w:lastColumn="0" w:lastRow="0" w:noHBand="0" w:noVBand="1" w:val="04A0"/>
+      </w:tblPr>
+      <w:tblGrid>
+        <w:gridCol w:w="5040"/>
+        <w:gridCol w:w="5040"/>
+      </w:tblGrid>
+      <w:tr>
+        <w:trPr>
+          <w:cantSplit/>
+        </w:trPr>
+        <w:tc>
+          <w:tcPr>
+            <w:tcW w:type="dxa" w:w="4968"/>
+          </w:tcPr>
+          <w:p>
+            <w:pPr>
+              <w:spacing w:after="60"/>
+              <w:jc w:val="center"/>
+            </w:pPr>
+            <w:r>
+              <w:drawing>
+                <wp:inline xmlns:a="http://schemas.openxmlformats.org/drawingml/2006/main" xmlns:pic="http://schemas.openxmlformats.org/drawingml/2006/picture">
+                  <wp:extent cx="2057400" cy="4440205"/>
+                  <wp:docPr id="3" name="Picture 3"/>
+                  <wp:cNvGraphicFramePr>
+                    <a:graphicFrameLocks noChangeAspect="1"/>
+                  </wp:cNvGraphicFramePr>
+                  <a:graphic>
+                    <a:graphicData uri="http://schemas.openxmlformats.org/drawingml/2006/picture">
+                      <pic:pic>
+                        <pic:nvPicPr>
+                          <pic:cNvPr id="0" name="before-home.png"/>
+                          <pic:cNvPicPr/>
+                        </pic:nvPicPr>
+                        <pic:blipFill>
+                          <a:blip r:embed="rId13"/>
+                          <a:stretch>
+                            <a:fillRect/>
+                          </a:stretch>
+                        </pic:blipFill>
+                        <pic:spPr>
+                          <a:xfrm>
+                            <a:off x="0" y="0"/>
+                            <a:ext cx="2057400" cy="4440205"/>
+                          </a:xfrm>
+                          <a:prstGeom prst="rect"/>
+                        </pic:spPr>
+                      </pic:pic>
+                    </a:graphicData>
+                  </a:graphic>
+                </wp:inline>
+              </w:drawing>
+            </w:r>
+          </w:p>
+        </w:tc>
+        <w:tc>
+          <w:tcPr>
+            <w:tcW w:type="dxa" w:w="4968"/>
+          </w:tcPr>
+          <w:p>
+            <w:pPr>
+              <w:spacing w:after="60"/>
+              <w:jc w:val="center"/>
+            </w:pPr>
+            <w:r>
+              <w:drawing>
+                <wp:inline xmlns:a="http://schemas.openxmlformats.org/drawingml/2006/main" xmlns:pic="http://schemas.openxmlformats.org/drawingml/2006/picture">
+                  <wp:extent cx="2057400" cy="4440205"/>
+                  <wp:docPr id="4" name="Picture 4"/>
+                  <wp:cNvGraphicFramePr>
+                    <a:graphicFrameLocks noChangeAspect="1"/>
+                  </wp:cNvGraphicFramePr>
+                  <a:graphic>
+                    <a:graphicData uri="http://schemas.openxmlformats.org/drawingml/2006/picture">
+                      <pic:pic>
+                        <pic:nvPicPr>
+                          <pic:cNvPr id="0" name="current-home.png"/>
+                          <pic:cNvPicPr/>
+                        </pic:nvPicPr>
+                        <pic:blipFill>
+                          <a:blip r:embed="rId11"/>
+                          <a:stretch>
+                            <a:fillRect/>
+                          </a:stretch>
+                        </pic:blipFill>
+                        <pic:spPr>
+                          <a:xfrm>
+                            <a:off x="0" y="0"/>
+                            <a:ext cx="2057400" cy="4440205"/>
+                          </a:xfrm>
+                          <a:prstGeom prst="rect"/>
+                        </pic:spPr>
+                      </pic:pic>
+                    </a:graphicData>
+                  </a:graphic>
+                </wp:inline>
+              </w:drawing>
+            </w:r>
+          </w:p>
+        </w:tc>
+      </w:tr>
+      <w:tr>
+        <w:trPr>
+          <w:cantSplit/>
+        </w:trPr>
+        <w:tc>
+          <w:tcPr>
+            <w:tcW w:type="dxa" w:w="4968"/>
+          </w:tcPr>
+          <w:p>
+            <w:pPr>
+              <w:pStyle w:val="Caption"/>
+              <w:jc w:val="center"/>
+            </w:pPr>
+            <w:r>
+              <w:t>Before · search-first Home and a lower Studio link</w:t>
+            </w:r>
+          </w:p>
+        </w:tc>
+        <w:tc>
+          <w:tcPr>
+            <w:tcW w:type="dxa" w:w="4968"/>
+          </w:tcPr>
+          <w:p>
+            <w:pPr>
+              <w:pStyle w:val="Caption"/>
+              <w:jc w:val="center"/>
+            </w:pPr>
+            <w:r>
+              <w:t>After · direct editor cards, clearer hierarchy and retained search</w:t>
+            </w:r>
+          </w:p>
+        </w:tc>
+      </w:tr>
+    </w:tbl>
+    <w:tbl>
+      <w:tblPr>
+        <w:tblW w:type="auto" w:w="0"/>
+        <w:tblLayout w:type="fixed"/>
+        <w:tblLook w:firstColumn="1" w:firstRow="1" w:lastColumn="0" w:lastRow="0" w:noHBand="0" w:noVBand="1" w:val="04A0"/>
+      </w:tblPr>
+      <w:tblGrid>
+        <w:gridCol w:w="5040"/>
+        <w:gridCol w:w="5040"/>
+      </w:tblGrid>
+      <w:tr>
+        <w:trPr>
+          <w:cantSplit/>
+        </w:trPr>
+        <w:tc>
+          <w:tcPr>
+            <w:tcW w:type="dxa" w:w="3600"/>
+            <w:shd w:fill="F1F1F1"/>
+          </w:tcPr>
+          <w:p>
+            <w:pPr>
+              <w:spacing w:after="120" w:before="120"/>
+            </w:pPr>
+            <w:r>
+              <w:rPr>
+                <w:b/>
+                <w:sz w:val="20"/>
+              </w:rPr>
+              <w:t>What changed</w:t>
+            </w:r>
+          </w:p>
+        </w:tc>
+        <w:tc>
+          <w:tcPr>
+            <w:tcW w:type="dxa" w:w="6336"/>
+            <w:shd w:fill="F1F1F1"/>
+          </w:tcPr>
+          <w:p>
+            <w:pPr>
+              <w:spacing w:after="120" w:before="120"/>
+            </w:pPr>
+            <w:r>
+              <w:rPr>
+                <w:b/>
+                <w:sz w:val="20"/>
+              </w:rPr>
+              <w:t>Why it helps</w:t>
+            </w:r>
+          </w:p>
+        </w:tc>
+      </w:tr>
+      <w:tr>
+        <w:trPr>
+          <w:cantSplit/>
+        </w:trPr>
+        <w:tc>
+          <w:tcPr>
+            <w:tcW w:type="dxa" w:w="3600"/>
+          </w:tcPr>
+          <w:p>
+            <w:pPr>
+              <w:spacing w:after="120" w:before="120"/>
+            </w:pPr>
+            <w:r>
+              <w:rPr>
+                <w:sz w:val="20"/>
+              </w:rPr>
+              <w:t>Honorable branding and a clearer heading</w:t>
+            </w:r>
+          </w:p>
+        </w:tc>
+        <w:tc>
+          <w:tcPr>
+            <w:tcW w:type="dxa" w:w="6336"/>
+          </w:tcPr>
+          <w:p>
+            <w:pPr>
+              <w:spacing w:after="120" w:before="120"/>
+            </w:pPr>
+            <w:r>
+              <w:rPr>
+                <w:sz w:val="20"/>
+              </w:rPr>
+              <w:t>Home introduces both the media library and the studio.</w:t>
+            </w:r>
+          </w:p>
+        </w:tc>
+      </w:tr>
+      <w:tr>
+        <w:trPr>
+          <w:cantSplit/>
+        </w:trPr>
+        <w:tc>
+          <w:tcPr>
+            <w:tcW w:type="dxa" w:w="3600"/>
+          </w:tcPr>
+          <w:p>
+            <w:pPr>
+              <w:spacing w:after="120" w:before="120"/>
+            </w:pPr>
+            <w:r>
+              <w:rPr>
+                <w:sz w:val="20"/>
+              </w:rPr>
+              <w:t>Two direct Android editor entry points</w:t>
+            </w:r>
+          </w:p>
+        </w:tc>
+        <w:tc>
+          <w:tcPr>
+            <w:tcW w:type="dxa" w:w="6336"/>
+          </w:tcPr>
+          <w:p>
+            <w:pPr>
+              <w:spacing w:after="120" w:before="120"/>
+            </w:pPr>
+            <w:r>
+              <w:rPr>
+                <w:sz w:val="20"/>
+              </w:rPr>
+              <w:t>Choose the photo or video picker without going through the Studio launcher.</w:t>
+            </w:r>
+          </w:p>
+        </w:tc>
+      </w:tr>
+      <w:tr>
+        <w:trPr>
+          <w:cantSplit/>
+        </w:trPr>
+        <w:tc>
+          <w:tcPr>
+            <w:tcW w:type="dxa" w:w="3600"/>
+          </w:tcPr>
+          <w:p>
+            <w:pPr>
+              <w:spacing w:after="120" w:before="120"/>
+            </w:pPr>
+            <w:r>
+              <w:rPr>
+                <w:sz w:val="20"/>
+              </w:rPr>
+              <w:t>Outlined cards and a restrained type scale</w:t>
+            </w:r>
+          </w:p>
+        </w:tc>
+        <w:tc>
+          <w:tcPr>
+            <w:tcW w:type="dxa" w:w="6336"/>
+          </w:tcPr>
+          <w:p>
+            <w:pPr>
+              <w:spacing w:after="120" w:before="120"/>
+            </w:pPr>
+            <w:r>
+              <w:rPr>
+                <w:sz w:val="20"/>
+              </w:rPr>
+              <w:t>White is the main surface; black controls and gray dividers keep the media prominent.</w:t>
+            </w:r>
+          </w:p>
+        </w:tc>
+      </w:tr>
+      <w:tr>
+        <w:trPr>
+          <w:cantSplit/>
+        </w:trPr>
+        <w:tc>
+          <w:tcPr>
+            <w:tcW w:type="dxa" w:w="3600"/>
+          </w:tcPr>
+          <w:p>
+            <w:pPr>
+              <w:spacing w:after="120" w:before="120"/>
+            </w:pPr>
+            <w:r>
+              <w:rPr>
+                <w:sz w:val="20"/>
+              </w:rPr>
+              <w:t>Search and library stay intact</w:t>
+            </w:r>
+          </w:p>
+        </w:tc>
+        <w:tc>
+          <w:tcPr>
+            <w:tcW w:type="dxa" w:w="6336"/>
+          </w:tcPr>
+          <w:p>
+            <w:pPr>
+              <w:spacing w:after="120" w:before="120"/>
+            </w:pPr>
+            <w:r>
+              <w:rPr>
+                <w:sz w:val="20"/>
+              </w:rPr>
+              <w:t>The design changes entry and layout, preserving the existing search and account/credit flow.</w:t>
+            </w:r>
+          </w:p>
+        </w:tc>
+      </w:tr>
+    </w:tbl>
+    <w:p>
+      <w:r>
+        <w:br w:type="page"/>
       </w:r>
     </w:p>
     <w:p>
       <w:pPr>
-        <w:pStyle w:val="Heading2"/>
+        <w:pStyle w:val="Heading1"/>
       </w:pPr>
       <w:r>
-        <w:t>Give a photo the finish you want</w:t>
+        <w:t>Inside the photo studio</w:t>
       </w:r>
     </w:p>
     <w:p>
       <w:r>
-        <w:t>Crop to a chosen shape, rotate or mirror the image, then adjust brightness, exposure, contrast and saturation. White balance, shadows and highlights give you more control over the light. RGB curves, a local light adjustment, vignette and sharpening help with finer finishing.</w:t>
+        <w:t>The photo editor keeps the image central. Its adjustment tray and inspector expose the tools already implemented in Android. These images are source illustrations, not proof of device rendering.</w:t>
       </w:r>
     </w:p>
-    <w:p>
-      <w:r>
-        <w:t>Add styled text for a cover or announcement. Compare with the original as you work, step backward or forward with undo and redo, and save a set of adjustments as a reusable photo look. Export a new PNG or JPEG copy; JPEG includes quality choices and PNG can keep transparency.</w:t>
-      </w:r>
-    </w:p>
+    <w:tbl>
+      <w:tblPr>
+        <w:tblW w:type="auto" w:w="0"/>
+        <w:tblLayout w:type="fixed"/>
+        <w:tblLook w:firstColumn="1" w:firstRow="1" w:lastColumn="0" w:lastRow="0" w:noHBand="0" w:noVBand="1" w:val="04A0"/>
+      </w:tblPr>
+      <w:tblGrid>
+        <w:gridCol w:w="5040"/>
+        <w:gridCol w:w="5040"/>
+      </w:tblGrid>
+      <w:tr>
+        <w:trPr>
+          <w:cantSplit/>
+        </w:trPr>
+        <w:tc>
+          <w:tcPr>
+            <w:tcW w:type="dxa" w:w="4968"/>
+          </w:tcPr>
+          <w:p>
+            <w:pPr>
+              <w:spacing w:after="60"/>
+              <w:jc w:val="center"/>
+            </w:pPr>
+            <w:r>
+              <w:drawing>
+                <wp:inline xmlns:a="http://schemas.openxmlformats.org/drawingml/2006/main" xmlns:pic="http://schemas.openxmlformats.org/drawingml/2006/picture">
+                  <wp:extent cx="1956816" cy="4223128"/>
+                  <wp:docPr id="5" name="Picture 5"/>
+                  <wp:cNvGraphicFramePr>
+                    <a:graphicFrameLocks noChangeAspect="1"/>
+                  </wp:cNvGraphicFramePr>
+                  <a:graphic>
+                    <a:graphicData uri="http://schemas.openxmlformats.org/drawingml/2006/picture">
+                      <pic:pic>
+                        <pic:nvPicPr>
+                          <pic:cNvPr id="0" name="current-photoWorkspace.png"/>
+                          <pic:cNvPicPr/>
+                        </pic:nvPicPr>
+                        <pic:blipFill>
+                          <a:blip r:embed="rId14"/>
+                          <a:stretch>
+                            <a:fillRect/>
+                          </a:stretch>
+                        </pic:blipFill>
+                        <pic:spPr>
+                          <a:xfrm>
+                            <a:off x="0" y="0"/>
+                            <a:ext cx="1956816" cy="4223128"/>
+                          </a:xfrm>
+                          <a:prstGeom prst="rect"/>
+                        </pic:spPr>
+                      </pic:pic>
+                    </a:graphicData>
+                  </a:graphic>
+                </wp:inline>
+              </w:drawing>
+            </w:r>
+          </w:p>
+        </w:tc>
+        <w:tc>
+          <w:tcPr>
+            <w:tcW w:type="dxa" w:w="4968"/>
+          </w:tcPr>
+          <w:p>
+            <w:pPr>
+              <w:spacing w:after="60"/>
+              <w:jc w:val="center"/>
+            </w:pPr>
+            <w:r>
+              <w:drawing>
+                <wp:inline xmlns:a="http://schemas.openxmlformats.org/drawingml/2006/main" xmlns:pic="http://schemas.openxmlformats.org/drawingml/2006/picture">
+                  <wp:extent cx="1956816" cy="4223128"/>
+                  <wp:docPr id="6" name="Picture 6"/>
+                  <wp:cNvGraphicFramePr>
+                    <a:graphicFrameLocks noChangeAspect="1"/>
+                  </wp:cNvGraphicFramePr>
+                  <a:graphic>
+                    <a:graphicData uri="http://schemas.openxmlformats.org/drawingml/2006/picture">
+                      <pic:pic>
+                        <pic:nvPicPr>
+                          <pic:cNvPr id="0" name="current-photoInspector.png"/>
+                          <pic:cNvPicPr/>
+                        </pic:nvPicPr>
+                        <pic:blipFill>
+                          <a:blip r:embed="rId15"/>
+                          <a:stretch>
+                            <a:fillRect/>
+                          </a:stretch>
+                        </pic:blipFill>
+                        <pic:spPr>
+                          <a:xfrm>
+                            <a:off x="0" y="0"/>
+                            <a:ext cx="1956816" cy="4223128"/>
+                          </a:xfrm>
+                          <a:prstGeom prst="rect"/>
+                        </pic:spPr>
+                      </pic:pic>
+                    </a:graphicData>
+                  </a:graphic>
+                </wp:inline>
+              </w:drawing>
+            </w:r>
+          </w:p>
+        </w:tc>
+      </w:tr>
+      <w:tr>
+        <w:trPr>
+          <w:cantSplit/>
+        </w:trPr>
+        <w:tc>
+          <w:tcPr>
+            <w:tcW w:type="dxa" w:w="4968"/>
+          </w:tcPr>
+          <w:p>
+            <w:pPr>
+              <w:pStyle w:val="Caption"/>
+              <w:jc w:val="center"/>
+            </w:pPr>
+            <w:r>
+              <w:t>Photo workspace · image, compare, adjustment tray and tool rail</w:t>
+            </w:r>
+          </w:p>
+        </w:tc>
+        <w:tc>
+          <w:tcPr>
+            <w:tcW w:type="dxa" w:w="4968"/>
+          </w:tcPr>
+          <w:p>
+            <w:pPr>
+              <w:pStyle w:val="Caption"/>
+              <w:jc w:val="center"/>
+            </w:pPr>
+            <w:r>
+              <w:t>Photo inspector · grouped tools for the selected image</w:t>
+            </w:r>
+          </w:p>
+        </w:tc>
+      </w:tr>
+    </w:tbl>
     <w:p>
       <w:pPr>
-        <w:pStyle w:val="Heading2"/>
+        <w:keepLines/>
       </w:pPr>
       <w:r>
-        <w:t>Use the local photo assistance</w:t>
+        <w:rPr>
+          <w:b/>
+        </w:rPr>
+        <w:t xml:space="preserve">Shape and light  </w:t>
       </w:r>
-    </w:p>
-    <w:p>
       <w:r>
-        <w:t>The existing on-device tools include scene-aware looks, person cutout, person-background blur and plain-color background replacement. Latin-script text recognition lets you review and explicitly copy recognized text. Free bundled editing tools are available to guests.</w:t>
-      </w:r>
-    </w:p>
-    <w:p>
-      <w:r>
-        <w:t>These tools work with the image you provide. They do not generate a new scene from a prompt. Person cutout is designed for people, and edge quality still needs checking on actual phone photos.</w:t>
-      </w:r>
-    </w:p>
-    <w:p>
-      <w:pPr>
-        <w:pStyle w:val="Heading2"/>
-      </w:pPr>
-      <w:r>
-        <w:t>Make something from a blank page</w:t>
-      </w:r>
-    </w:p>
-    <w:p>
-      <w:r>
-        <w:t>The offline drawing workspace uses Excalidraw, an open-source tool integrated with Honorable styling and retained license notices. Draw freehand, arrange shapes, add text and undo changes. Keep one editable drawing draft on the device, or send a PNG into the photo editor for finishing.</w:t>
-      </w:r>
-    </w:p>
-    <w:p>
-      <w:r>
-        <w:t>Blank square, portrait and landscape images also open in the photo editor. Drawing drafts and video projects are separate. A drawing draft is one current local save, not a full project library.</w:t>
-      </w:r>
-    </w:p>
-    <w:p>
-      <w:pPr>
-        <w:pStyle w:val="Heading2"/>
-      </w:pPr>
-      <w:r>
-        <w:t>Things you could make</w:t>
+        <w:t>Crop to a ratio, rotate or mirror, adjust brightness, exposure, contrast, saturation and white balance. Shadows, highlights, RGB curves and local light support finer work.</w:t>
       </w:r>
     </w:p>
     <w:p>
@@ -166,10 +745,10 @@
         <w:rPr>
           <w:b/>
         </w:rPr>
-        <w:t xml:space="preserve">A video cover  </w:t>
+        <w:t xml:space="preserve">Finishing and reuse  </w:t>
       </w:r>
       <w:r>
-        <w:t>Draw a simple layout, add a title, then finish its color and framing in the photo editor.</w:t>
+        <w:t>Sharpen, add a vignette or styled text, compare with the original, undo and redo. Save global adjustments as a reusable look; framing, people and text are excluded from that preset.</w:t>
       </w:r>
     </w:p>
     <w:p>
@@ -180,38 +759,18 @@
         <w:rPr>
           <w:b/>
         </w:rPr>
-        <w:t xml:space="preserve">A portrait graphic  </w:t>
+        <w:t xml:space="preserve">Local assistance and output  </w:t>
       </w:r>
       <w:r>
-        <w:t>Use person cutout with a transparent PNG or a plain background, then add text. Check the edges before sharing.</w:t>
+        <w:t>Scene-aware looks, person cutout, person-background blur or plain replacement, and Latin-script text recognition are implemented. Export a protected PNG or JPEG copy; PNG can retain transparency.</w:t>
       </w:r>
     </w:p>
     <w:p>
       <w:pPr>
-        <w:keepLines/>
+        <w:pStyle w:val="Caption"/>
       </w:pPr>
       <w:r>
-        <w:rPr>
-          <w:b/>
-        </w:rPr>
-        <w:t xml:space="preserve">A consistent photo set  </w:t>
-      </w:r>
-      <w:r>
-        <w:t>Save a photo look and apply it to other images, adjusting each one as needed.</w:t>
-      </w:r>
-    </w:p>
-    <w:p>
-      <w:pPr>
-        <w:keepLines/>
-      </w:pPr>
-      <w:r>
-        <w:rPr>
-          <w:b/>
-        </w:rPr>
-        <w:t xml:space="preserve">A diagram or illustrated idea  </w:t>
-      </w:r>
-      <w:r>
-        <w:t>Sketch with shapes and text, save the editable draft, and export an image when it is ready.</w:t>
+        <w:t>You could make a portrait graphic, a video cover or a consistent photo set. Person-edge quality and saved pixels still need physical-device checks. These tools do not generate new scenes.</w:t>
       </w:r>
     </w:p>
     <w:p>
@@ -224,74 +783,165 @@
         <w:pStyle w:val="Heading1"/>
       </w:pPr>
       <w:r>
-        <w:t>Videos from first clip to export</w:t>
+        <w:t>Inside the video studio</w:t>
       </w:r>
     </w:p>
     <w:p>
       <w:r>
-        <w:t>The native video editor works with a real sequence of source clips. It can turn a few recordings into a shorter story while leaving the original files alone.</w:t>
+        <w:t>The current video editor has a real clip sequence with source frames, timing and contextual tools. It supports one video sequence plus one looping soundtrack; it is not an arbitrary multitrack compositor.</w:t>
       </w:r>
     </w:p>
+    <w:tbl>
+      <w:tblPr>
+        <w:tblW w:type="auto" w:w="0"/>
+        <w:tblLayout w:type="fixed"/>
+        <w:tblLook w:firstColumn="1" w:firstRow="1" w:lastColumn="0" w:lastRow="0" w:noHBand="0" w:noVBand="1" w:val="04A0"/>
+      </w:tblPr>
+      <w:tblGrid>
+        <w:gridCol w:w="5040"/>
+        <w:gridCol w:w="5040"/>
+      </w:tblGrid>
+      <w:tr>
+        <w:trPr>
+          <w:cantSplit/>
+        </w:trPr>
+        <w:tc>
+          <w:tcPr>
+            <w:tcW w:type="dxa" w:w="4968"/>
+          </w:tcPr>
+          <w:p>
+            <w:pPr>
+              <w:spacing w:after="60"/>
+              <w:jc w:val="center"/>
+            </w:pPr>
+            <w:r>
+              <w:drawing>
+                <wp:inline xmlns:a="http://schemas.openxmlformats.org/drawingml/2006/main" xmlns:pic="http://schemas.openxmlformats.org/drawingml/2006/picture">
+                  <wp:extent cx="1956816" cy="4223128"/>
+                  <wp:docPr id="7" name="Picture 7"/>
+                  <wp:cNvGraphicFramePr>
+                    <a:graphicFrameLocks noChangeAspect="1"/>
+                  </wp:cNvGraphicFramePr>
+                  <a:graphic>
+                    <a:graphicData uri="http://schemas.openxmlformats.org/drawingml/2006/picture">
+                      <pic:pic>
+                        <pic:nvPicPr>
+                          <pic:cNvPr id="0" name="current-videoWorkspace.png"/>
+                          <pic:cNvPicPr/>
+                        </pic:nvPicPr>
+                        <pic:blipFill>
+                          <a:blip r:embed="rId12"/>
+                          <a:stretch>
+                            <a:fillRect/>
+                          </a:stretch>
+                        </pic:blipFill>
+                        <pic:spPr>
+                          <a:xfrm>
+                            <a:off x="0" y="0"/>
+                            <a:ext cx="1956816" cy="4223128"/>
+                          </a:xfrm>
+                          <a:prstGeom prst="rect"/>
+                        </pic:spPr>
+                      </pic:pic>
+                    </a:graphicData>
+                  </a:graphic>
+                </wp:inline>
+              </w:drawing>
+            </w:r>
+          </w:p>
+        </w:tc>
+        <w:tc>
+          <w:tcPr>
+            <w:tcW w:type="dxa" w:w="4968"/>
+          </w:tcPr>
+          <w:p>
+            <w:pPr>
+              <w:spacing w:after="60"/>
+              <w:jc w:val="center"/>
+            </w:pPr>
+            <w:r>
+              <w:drawing>
+                <wp:inline xmlns:a="http://schemas.openxmlformats.org/drawingml/2006/main" xmlns:pic="http://schemas.openxmlformats.org/drawingml/2006/picture">
+                  <wp:extent cx="1956816" cy="4223128"/>
+                  <wp:docPr id="8" name="Picture 8"/>
+                  <wp:cNvGraphicFramePr>
+                    <a:graphicFrameLocks noChangeAspect="1"/>
+                  </wp:cNvGraphicFramePr>
+                  <a:graphic>
+                    <a:graphicData uri="http://schemas.openxmlformats.org/drawingml/2006/picture">
+                      <pic:pic>
+                        <pic:nvPicPr>
+                          <pic:cNvPr id="0" name="current-videoInspector.png"/>
+                          <pic:cNvPicPr/>
+                        </pic:nvPicPr>
+                        <pic:blipFill>
+                          <a:blip r:embed="rId16"/>
+                          <a:stretch>
+                            <a:fillRect/>
+                          </a:stretch>
+                        </pic:blipFill>
+                        <pic:spPr>
+                          <a:xfrm>
+                            <a:off x="0" y="0"/>
+                            <a:ext cx="1956816" cy="4223128"/>
+                          </a:xfrm>
+                          <a:prstGeom prst="rect"/>
+                        </pic:spPr>
+                      </pic:pic>
+                    </a:graphicData>
+                  </a:graphic>
+                </wp:inline>
+              </w:drawing>
+            </w:r>
+          </w:p>
+        </w:tc>
+      </w:tr>
+      <w:tr>
+        <w:trPr>
+          <w:cantSplit/>
+        </w:trPr>
+        <w:tc>
+          <w:tcPr>
+            <w:tcW w:type="dxa" w:w="4968"/>
+          </w:tcPr>
+          <w:p>
+            <w:pPr>
+              <w:pStyle w:val="Caption"/>
+              <w:jc w:val="center"/>
+            </w:pPr>
+            <w:r>
+              <w:t>Video workspace · sample filmstrip, timecode and selected clip tools</w:t>
+            </w:r>
+          </w:p>
+        </w:tc>
+        <w:tc>
+          <w:tcPr>
+            <w:tcW w:type="dxa" w:w="4968"/>
+          </w:tcPr>
+          <w:p>
+            <w:pPr>
+              <w:pStyle w:val="Caption"/>
+              <w:jc w:val="center"/>
+            </w:pPr>
+            <w:r>
+              <w:t>Video inspector · story tools, captions, sound, projects and output</w:t>
+            </w:r>
+          </w:p>
+        </w:tc>
+      </w:tr>
+    </w:tbl>
     <w:p>
       <w:pPr>
-        <w:pStyle w:val="Heading2"/>
+        <w:keepLines/>
       </w:pPr>
       <w:r>
-        <w:t>Build and refine the timeline</w:t>
+        <w:rPr>
+          <w:b/>
+        </w:rPr>
+        <w:t xml:space="preserve">Build the sequence  </w:t>
       </w:r>
-    </w:p>
-    <w:p>
       <w:r>
-        <w:t>Import several videos, put them in order, trim the useful sections, split clips, duplicate a moment or delete it. Precise trim accepts source seconds to three decimal places. Change playback speed and volume, mute a clip, and use the filmstrip and project preview to review the sequence. Codec output is not guaranteed frame-exact.</w:t>
-      </w:r>
-    </w:p>
-    <w:p>
-      <w:r>
-        <w:t>The new montage builder gives you a quick starting cut. For longer timelines it samples clips in order, keeping up to 60 excerpts rather than trying to squeeze every clip into an unreadable instant. You choose the final edit.</w:t>
-      </w:r>
-    </w:p>
-    <w:p>
-      <w:pPr>
-        <w:pStyle w:val="Heading2"/>
-      </w:pPr>
-      <w:r>
-        <w:t>Finish the picture and sound</w:t>
-      </w:r>
-    </w:p>
-    <w:p>
-      <w:r>
-        <w:t>Adjust clip color and white balance, copy a grade across the timeline, rotate or mirror footage, and choose output framing with fit or crop. Add styled titles and fades through black at clip edges. These fades are not overlapping crossfades.</w:t>
-      </w:r>
-    </w:p>
-    <w:p>
-      <w:r>
-        <w:t>Add one looping soundtrack, change its level and apply a project audio fade. Preview the mix before exporting a video copy. Audio-only export can also save the edited project as AAC in an M4A file.</w:t>
-      </w:r>
-    </w:p>
-    <w:p>
-      <w:pPr>
-        <w:pStyle w:val="Heading2"/>
-      </w:pPr>
-      <w:r>
-        <w:t>Add captions and keep your work</w:t>
-      </w:r>
-    </w:p>
-    <w:p>
-      <w:r>
-        <w:t>Write captions manually, use the new script tool, or import a compatible UTF-8 SRT file for a clip. Captions follow the clip through trims, splitting, order changes and speed changes. Export project subtitles as SRT if you need a separate subtitle file.</w:t>
-      </w:r>
-    </w:p>
-    <w:p>
-      <w:r>
-        <w:t>Guest video projects can be saved locally and restored after reopening the same original video. The originals must remain available. Account drafts stay separate. Undo, redo and bounded recovery help you revise without starting over.</w:t>
-      </w:r>
-    </w:p>
-    <w:p>
-      <w:pPr>
-        <w:pStyle w:val="Heading2"/>
-      </w:pPr>
-      <w:r>
-        <w:t>Things you could make</w:t>
+        <w:t>Import videos, trim, split, duplicate, delete and reorder clips. Change speed or volume. Precise trim accepts source seconds to three decimals; final codec output is not guaranteed frame-exact.</w:t>
       </w:r>
     </w:p>
     <w:p>
@@ -302,10 +952,10 @@
         <w:rPr>
           <w:b/>
         </w:rPr>
-        <w:t xml:space="preserve">A short trip recap  </w:t>
+        <w:t xml:space="preserve">Picture and sound  </w:t>
       </w:r>
       <w:r>
-        <w:t>Arrange your recordings, build a 30-second montage, adjust a few cuts and add music.</w:t>
+        <w:t>Adjust clip color and white balance, copy a grade, fit or crop output framing, rotate and mirror. Add styled titles, fades through black and one looping soundtrack. Preview before exporting a video or audio-only M4A copy.</w:t>
       </w:r>
     </w:p>
     <w:p>
@@ -316,43 +966,18 @@
         <w:rPr>
           <w:b/>
         </w:rPr>
-        <w:t xml:space="preserve">A product walkthrough  </w:t>
+        <w:t xml:space="preserve">Keep the work editable  </w:t>
       </w:r>
       <w:r>
-        <w:t>Trim the pauses, paste your explanation as caption lines, review the timing and export a copy.</w:t>
+        <w:t>Manual captions and SRT follow clip timing through trims, speed and order. Save and restore local guest video projects after reopening the same original. Originals must remain available; account drafts stay separate.</w:t>
       </w:r>
     </w:p>
     <w:p>
       <w:pPr>
-        <w:keepLines/>
+        <w:pStyle w:val="Caption"/>
       </w:pPr>
       <w:r>
-        <w:rPr>
-          <w:b/>
-        </w:rPr>
-        <w:t xml:space="preserve">A silent tutorial  </w:t>
-      </w:r>
-      <w:r>
-        <w:t>Use captions and titles to explain steps without requiring viewers to turn on sound.</w:t>
-      </w:r>
-    </w:p>
-    <w:p>
-      <w:pPr>
-        <w:keepLines/>
-      </w:pPr>
-      <w:r>
-        <w:rPr>
-          <w:b/>
-        </w:rPr>
-        <w:t xml:space="preserve">An audio extract  </w:t>
-      </w:r>
-      <w:r>
-        <w:t>Keep the sections you want in the timeline and export an audio-only copy.</w:t>
-      </w:r>
-    </w:p>
-    <w:p>
-      <w:r>
-        <w:t>The existing AI video looks and rough-cut suggestions use local sampled frames. They remain experimental assistance, not generated video, speech understanding or automatic beat matching.</w:t>
+        <w:t>The timeline illustration deliberately avoids invented audio waveforms, overlapping crossfades or compositing tracks. Those advanced systems are unfinished.</w:t>
       </w:r>
     </w:p>
     <w:p>
@@ -365,7 +990,164 @@
         <w:pStyle w:val="Heading1"/>
       </w:pPr>
       <w:r>
-        <w:t>What changed and what comes next</w:t>
+        <w:t>Two recent story tools</w:t>
+      </w:r>
+    </w:p>
+    <w:p>
+      <w:r>
+        <w:t>These two editing workflows were added in the preceding feature increment and are included in today’s build. They run locally, use the existing project format and do not introduce a new AI model.</w:t>
+      </w:r>
+    </w:p>
+    <w:tbl>
+      <w:tblPr>
+        <w:tblW w:type="auto" w:w="0"/>
+        <w:tblLayout w:type="fixed"/>
+        <w:tblLook w:firstColumn="1" w:firstRow="1" w:lastColumn="0" w:lastRow="0" w:noHBand="0" w:noVBand="1" w:val="04A0"/>
+      </w:tblPr>
+      <w:tblGrid>
+        <w:gridCol w:w="5040"/>
+        <w:gridCol w:w="5040"/>
+      </w:tblGrid>
+      <w:tr>
+        <w:trPr>
+          <w:cantSplit/>
+        </w:trPr>
+        <w:tc>
+          <w:tcPr>
+            <w:tcW w:type="dxa" w:w="4968"/>
+          </w:tcPr>
+          <w:p>
+            <w:pPr>
+              <w:spacing w:after="60"/>
+              <w:jc w:val="center"/>
+            </w:pPr>
+            <w:r>
+              <w:drawing>
+                <wp:inline xmlns:a="http://schemas.openxmlformats.org/drawingml/2006/main" xmlns:pic="http://schemas.openxmlformats.org/drawingml/2006/picture">
+                  <wp:extent cx="1956816" cy="4223128"/>
+                  <wp:docPr id="9" name="Picture 9"/>
+                  <wp:cNvGraphicFramePr>
+                    <a:graphicFrameLocks noChangeAspect="1"/>
+                  </wp:cNvGraphicFramePr>
+                  <a:graphic>
+                    <a:graphicData uri="http://schemas.openxmlformats.org/drawingml/2006/picture">
+                      <pic:pic>
+                        <pic:nvPicPr>
+                          <pic:cNvPr id="0" name="current-montage.png"/>
+                          <pic:cNvPicPr/>
+                        </pic:nvPicPr>
+                        <pic:blipFill>
+                          <a:blip r:embed="rId17"/>
+                          <a:stretch>
+                            <a:fillRect/>
+                          </a:stretch>
+                        </pic:blipFill>
+                        <pic:spPr>
+                          <a:xfrm>
+                            <a:off x="0" y="0"/>
+                            <a:ext cx="1956816" cy="4223128"/>
+                          </a:xfrm>
+                          <a:prstGeom prst="rect"/>
+                        </pic:spPr>
+                      </pic:pic>
+                    </a:graphicData>
+                  </a:graphic>
+                </wp:inline>
+              </w:drawing>
+            </w:r>
+          </w:p>
+        </w:tc>
+        <w:tc>
+          <w:tcPr>
+            <w:tcW w:type="dxa" w:w="4968"/>
+          </w:tcPr>
+          <w:p>
+            <w:pPr>
+              <w:spacing w:after="60"/>
+              <w:jc w:val="center"/>
+            </w:pPr>
+            <w:r>
+              <w:drawing>
+                <wp:inline xmlns:a="http://schemas.openxmlformats.org/drawingml/2006/main" xmlns:pic="http://schemas.openxmlformats.org/drawingml/2006/picture">
+                  <wp:extent cx="1956816" cy="4223128"/>
+                  <wp:docPr id="10" name="Picture 10"/>
+                  <wp:cNvGraphicFramePr>
+                    <a:graphicFrameLocks noChangeAspect="1"/>
+                  </wp:cNvGraphicFramePr>
+                  <a:graphic>
+                    <a:graphicData uri="http://schemas.openxmlformats.org/drawingml/2006/picture">
+                      <pic:pic>
+                        <pic:nvPicPr>
+                          <pic:cNvPr id="0" name="current-script.png"/>
+                          <pic:cNvPicPr/>
+                        </pic:nvPicPr>
+                        <pic:blipFill>
+                          <a:blip r:embed="rId18"/>
+                          <a:stretch>
+                            <a:fillRect/>
+                          </a:stretch>
+                        </pic:blipFill>
+                        <pic:spPr>
+                          <a:xfrm>
+                            <a:off x="0" y="0"/>
+                            <a:ext cx="1956816" cy="4223128"/>
+                          </a:xfrm>
+                          <a:prstGeom prst="rect"/>
+                        </pic:spPr>
+                      </pic:pic>
+                    </a:graphicData>
+                  </a:graphic>
+                </wp:inline>
+              </w:drawing>
+            </w:r>
+          </w:p>
+        </w:tc>
+      </w:tr>
+      <w:tr>
+        <w:trPr>
+          <w:cantSplit/>
+        </w:trPr>
+        <w:tc>
+          <w:tcPr>
+            <w:tcW w:type="dxa" w:w="4968"/>
+          </w:tcPr>
+          <w:p>
+            <w:pPr>
+              <w:pStyle w:val="Caption"/>
+              <w:jc w:val="center"/>
+            </w:pPr>
+            <w:r>
+              <w:t>Montage review · choose 15, 30 or 60 seconds</w:t>
+            </w:r>
+          </w:p>
+        </w:tc>
+        <w:tc>
+          <w:tcPr>
+            <w:tcW w:type="dxa" w:w="4968"/>
+          </w:tcPr>
+          <w:p>
+            <w:pPr>
+              <w:pStyle w:val="Caption"/>
+              <w:jc w:val="center"/>
+            </w:pPr>
+            <w:r>
+              <w:t>Script captions · user-written text with estimated timing</w:t>
+            </w:r>
+          </w:p>
+        </w:tc>
+      </w:tr>
+    </w:tbl>
+    <w:p>
+      <w:pPr>
+        <w:pStyle w:val="Heading2"/>
+      </w:pPr>
+      <w:r>
+        <w:t>Build a montage</w:t>
+      </w:r>
+    </w:p>
+    <w:p>
+      <w:r>
+        <w:t>Arrange your recordings, then open Project and choose Build a montage. Honorable takes balanced centre excerpts in the current order and redistributes time from short clips. It keeps up to 60 excerpts, preserves speed, color, titles, visible captions and music, and shows the actual proposed length. Apply, preview and refine; one Undo restores the full timeline. Short footage can produce a shorter result.</w:t>
       </w:r>
     </w:p>
     <w:p>
@@ -373,12 +1155,191 @@
         <w:pStyle w:val="Heading2"/>
       </w:pPr>
       <w:r>
-        <w:t>Compared with the oldest version</w:t>
+        <w:t>Script to captions</w:t>
       </w:r>
     </w:p>
     <w:p>
       <w:r>
-        <w:t>The oldest Git snapshot, 424cf33, held the original Android interface and local search foundations in a ZIP. We continued that repository rather than replacing the search engine. The work since then adds a React Native app shell, native photo and video editors, offline guest access, local drawing and safer export paths.</w:t>
+        <w:t>Paste one line per cue under Titles. Longer lines receive more time across the selected clip. Review the proposal before replacing existing captions, then adjust individual cues or export project SRT. Up to 100 lines and 240 characters per line are supported, with at least half a playback second per cue. Timing is estimated from text, not synchronized to recognized speech.</w:t>
+      </w:r>
+    </w:p>
+    <w:p>
+      <w:pPr>
+        <w:pStyle w:val="Caption"/>
+      </w:pPr>
+      <w:r>
+        <w:t>Useful for a trip recap, a product walkthrough or a tutorial watched without sound. The existing experimental AI rough cut is a separate sampled-frame tool.</w:t>
+      </w:r>
+    </w:p>
+    <w:p>
+      <w:r>
+        <w:br w:type="page"/>
+      </w:r>
+    </w:p>
+    <w:p>
+      <w:pPr>
+        <w:pStyle w:val="Heading1"/>
+      </w:pPr>
+      <w:r>
+        <w:t>Create from a blank page</w:t>
+      </w:r>
+    </w:p>
+    <w:p>
+      <w:r>
+        <w:t>Drawing and blank-image creation give the app a starting point beyond existing media. The offline guest screen has been redesigned to make the available choices easier to scan.</w:t>
+      </w:r>
+    </w:p>
+    <w:tbl>
+      <w:tblPr>
+        <w:tblW w:type="auto" w:w="0"/>
+        <w:tblLayout w:type="fixed"/>
+        <w:tblLook w:firstColumn="1" w:firstRow="1" w:lastColumn="0" w:lastRow="0" w:noHBand="0" w:noVBand="1" w:val="04A0"/>
+      </w:tblPr>
+      <w:tblGrid>
+        <w:gridCol w:w="5040"/>
+        <w:gridCol w:w="5040"/>
+      </w:tblGrid>
+      <w:tr>
+        <w:trPr>
+          <w:cantSplit/>
+        </w:trPr>
+        <w:tc>
+          <w:tcPr>
+            <w:tcW w:type="dxa" w:w="4968"/>
+          </w:tcPr>
+          <w:p>
+            <w:pPr>
+              <w:spacing w:after="60"/>
+              <w:jc w:val="center"/>
+            </w:pPr>
+            <w:r>
+              <w:drawing>
+                <wp:inline xmlns:a="http://schemas.openxmlformats.org/drawingml/2006/main" xmlns:pic="http://schemas.openxmlformats.org/drawingml/2006/picture">
+                  <wp:extent cx="1956816" cy="4223128"/>
+                  <wp:docPr id="11" name="Picture 11"/>
+                  <wp:cNvGraphicFramePr>
+                    <a:graphicFrameLocks noChangeAspect="1"/>
+                  </wp:cNvGraphicFramePr>
+                  <a:graphic>
+                    <a:graphicData uri="http://schemas.openxmlformats.org/drawingml/2006/picture">
+                      <pic:pic>
+                        <pic:nvPicPr>
+                          <pic:cNvPr id="0" name="current-guest.png"/>
+                          <pic:cNvPicPr/>
+                        </pic:nvPicPr>
+                        <pic:blipFill>
+                          <a:blip r:embed="rId19"/>
+                          <a:stretch>
+                            <a:fillRect/>
+                          </a:stretch>
+                        </pic:blipFill>
+                        <pic:spPr>
+                          <a:xfrm>
+                            <a:off x="0" y="0"/>
+                            <a:ext cx="1956816" cy="4223128"/>
+                          </a:xfrm>
+                          <a:prstGeom prst="rect"/>
+                        </pic:spPr>
+                      </pic:pic>
+                    </a:graphicData>
+                  </a:graphic>
+                </wp:inline>
+              </w:drawing>
+            </w:r>
+          </w:p>
+        </w:tc>
+        <w:tc>
+          <w:tcPr>
+            <w:tcW w:type="dxa" w:w="4968"/>
+          </w:tcPr>
+          <w:p>
+            <w:pPr>
+              <w:spacing w:after="60"/>
+              <w:jc w:val="center"/>
+            </w:pPr>
+            <w:r>
+              <w:drawing>
+                <wp:inline xmlns:a="http://schemas.openxmlformats.org/drawingml/2006/main" xmlns:pic="http://schemas.openxmlformats.org/drawingml/2006/picture">
+                  <wp:extent cx="1956816" cy="4223128"/>
+                  <wp:docPr id="12" name="Picture 12"/>
+                  <wp:cNvGraphicFramePr>
+                    <a:graphicFrameLocks noChangeAspect="1"/>
+                  </wp:cNvGraphicFramePr>
+                  <a:graphic>
+                    <a:graphicData uri="http://schemas.openxmlformats.org/drawingml/2006/picture">
+                      <pic:pic>
+                        <pic:nvPicPr>
+                          <pic:cNvPr id="0" name="current-drawing.png"/>
+                          <pic:cNvPicPr/>
+                        </pic:nvPicPr>
+                        <pic:blipFill>
+                          <a:blip r:embed="rId20"/>
+                          <a:stretch>
+                            <a:fillRect/>
+                          </a:stretch>
+                        </pic:blipFill>
+                        <pic:spPr>
+                          <a:xfrm>
+                            <a:off x="0" y="0"/>
+                            <a:ext cx="1956816" cy="4223128"/>
+                          </a:xfrm>
+                          <a:prstGeom prst="rect"/>
+                        </pic:spPr>
+                      </pic:pic>
+                    </a:graphicData>
+                  </a:graphic>
+                </wp:inline>
+              </w:drawing>
+            </w:r>
+          </w:p>
+        </w:tc>
+      </w:tr>
+      <w:tr>
+        <w:trPr>
+          <w:cantSplit/>
+        </w:trPr>
+        <w:tc>
+          <w:tcPr>
+            <w:tcW w:type="dxa" w:w="4968"/>
+          </w:tcPr>
+          <w:p>
+            <w:pPr>
+              <w:pStyle w:val="Caption"/>
+              <w:jc w:val="center"/>
+            </w:pPr>
+            <w:r>
+              <w:t>Offline Home · actual React Native component adapted to HTML</w:t>
+            </w:r>
+          </w:p>
+        </w:tc>
+        <w:tc>
+          <w:tcPr>
+            <w:tcW w:type="dxa" w:w="4968"/>
+          </w:tcPr>
+          <w:p>
+            <w:pPr>
+              <w:pStyle w:val="Caption"/>
+              <w:jc w:val="center"/>
+            </w:pPr>
+            <w:r>
+              <w:t>Drawing workflow · illustration of the integrated manual workspace</w:t>
+            </w:r>
+          </w:p>
+        </w:tc>
+      </w:tr>
+    </w:tbl>
+    <w:p>
+      <w:pPr>
+        <w:keepLines/>
+      </w:pPr>
+      <w:r>
+        <w:rPr>
+          <w:b/>
+        </w:rPr>
+        <w:t xml:space="preserve">Draw an idea  </w:t>
+      </w:r>
+      <w:r>
+        <w:t>The Android app integrates MIT-licensed Excalidraw with Honorable styling and retained notices. Use freehand drawing, shapes, text and undo. Keep one bounded editable local draft or send a PNG into the photo editor.</w:t>
       </w:r>
     </w:p>
     <w:p>
@@ -389,10 +1350,10 @@
         <w:rPr>
           <w:b/>
         </w:rPr>
-        <w:t xml:space="preserve">More to do with your own media  </w:t>
+        <w:t xml:space="preserve">Choose a canvas  </w:t>
       </w:r>
       <w:r>
-        <w:t>Photo finishing, local person tools, reusable looks, multi-source video editing, music, captions, saved video projects, drawing and blank-image creation now sit alongside the original search foundations.</w:t>
+        <w:t>Blank square, portrait and landscape images open in the existing photo editor. Add text and finish the image, then export a new copy. Manual creation does not require a hosted generation service.</w:t>
       </w:r>
     </w:p>
     <w:p>
@@ -403,38 +1364,720 @@
         <w:rPr>
           <w:b/>
         </w:rPr>
-        <w:t xml:space="preserve">More control while editing  </w:t>
+        <w:t xml:space="preserve">Start without an account  </w:t>
       </w:r>
       <w:r>
-        <w:t>Contextual tools and inspector panels, preview, compare, undo and redo, precise trim, editable captions and reusable adjustments reduce the need to restart an edit.</w:t>
+        <w:t>Offline guests can edit local photos and videos and use approved bundled on-device tools. Search, credits and account features retain their authorization requirements.</w:t>
       </w:r>
     </w:p>
     <w:p>
       <w:pPr>
-        <w:keepLines/>
+        <w:pStyle w:val="Caption"/>
       </w:pPr>
       <w:r>
-        <w:rPr>
-          <w:b/>
-        </w:rPr>
-        <w:t xml:space="preserve">Safer local workflows  </w:t>
+        <w:t>You could sketch a diagram, plan a cover, make an announcement or create a simple illustration. The drawing save is one current draft, not a full multi-project library. The browser illustration does not run Excalidraw or native exports.</w:t>
       </w:r>
+    </w:p>
+    <w:p>
       <w:r>
-        <w:t>Exports are designed to create protected new copies. Import permissions, stale analysis results, bounded recovery, account separation and sign-in handling were hardened. Existing credit rules and server authority were preserved.</w:t>
+        <w:br w:type="page"/>
       </w:r>
     </w:p>
     <w:p>
       <w:pPr>
-        <w:keepLines/>
+        <w:pStyle w:val="Heading1"/>
       </w:pPr>
       <w:r>
-        <w:rPr>
-          <w:b/>
-        </w:rPr>
-        <w:t xml:space="preserve">A cleaner project  </w:t>
+        <w:t>The changes across versions</w:t>
       </w:r>
+    </w:p>
+    <w:p>
       <w:r>
-        <w:t>The repository now has a clear home page and current product report. Superseded reports and design references are archived. Obsidian notes track verified work and remaining acceptance tasks.</w:t>
+        <w:t>There are three useful comparisons: the oldest repository snapshot, the previous feature candidate and today’s interface update. Keeping them separate avoids counting the same feature twice.</w:t>
+      </w:r>
+    </w:p>
+    <w:tbl>
+      <w:tblPr>
+        <w:tblW w:type="auto" w:w="0"/>
+        <w:tblLayout w:type="fixed"/>
+        <w:tblLook w:firstColumn="1" w:firstRow="1" w:lastColumn="0" w:lastRow="0" w:noHBand="0" w:noVBand="1" w:val="04A0"/>
+      </w:tblPr>
+      <w:tblGrid>
+        <w:gridCol w:w="3360"/>
+        <w:gridCol w:w="3360"/>
+        <w:gridCol w:w="3360"/>
+      </w:tblGrid>
+      <w:tr>
+        <w:trPr>
+          <w:cantSplit/>
+        </w:trPr>
+        <w:tc>
+          <w:tcPr>
+            <w:tcW w:type="dxa" w:w="1584"/>
+            <w:shd w:fill="F1F1F1"/>
+          </w:tcPr>
+          <w:p>
+            <w:pPr>
+              <w:spacing w:after="120" w:before="120"/>
+            </w:pPr>
+            <w:r>
+              <w:rPr>
+                <w:b/>
+                <w:sz w:val="20"/>
+              </w:rPr>
+              <w:t>Area</w:t>
+            </w:r>
+          </w:p>
+        </w:tc>
+        <w:tc>
+          <w:tcPr>
+            <w:tcW w:type="dxa" w:w="4032"/>
+            <w:shd w:fill="F1F1F1"/>
+          </w:tcPr>
+          <w:p>
+            <w:pPr>
+              <w:spacing w:after="120" w:before="120"/>
+            </w:pPr>
+            <w:r>
+              <w:rPr>
+                <w:b/>
+                <w:sz w:val="20"/>
+              </w:rPr>
+              <w:t>Oldest or earlier state</w:t>
+            </w:r>
+          </w:p>
+        </w:tc>
+        <w:tc>
+          <w:tcPr>
+            <w:tcW w:type="dxa" w:w="4320"/>
+            <w:shd w:fill="F1F1F1"/>
+          </w:tcPr>
+          <w:p>
+            <w:pPr>
+              <w:spacing w:after="120" w:before="120"/>
+            </w:pPr>
+            <w:r>
+              <w:rPr>
+                <w:b/>
+                <w:sz w:val="20"/>
+              </w:rPr>
+              <w:t>Current implementation</w:t>
+            </w:r>
+          </w:p>
+        </w:tc>
+      </w:tr>
+      <w:tr>
+        <w:trPr>
+          <w:cantSplit/>
+        </w:trPr>
+        <w:tc>
+          <w:tcPr>
+            <w:tcW w:type="dxa" w:w="1584"/>
+          </w:tcPr>
+          <w:p>
+            <w:pPr>
+              <w:spacing w:after="120" w:before="120"/>
+            </w:pPr>
+            <w:r>
+              <w:rPr>
+                <w:sz w:val="20"/>
+              </w:rPr>
+              <w:t>Original app</w:t>
+            </w:r>
+          </w:p>
+        </w:tc>
+        <w:tc>
+          <w:tcPr>
+            <w:tcW w:type="dxa" w:w="4032"/>
+          </w:tcPr>
+          <w:p>
+            <w:pPr>
+              <w:spacing w:after="120" w:before="120"/>
+            </w:pPr>
+            <w:r>
+              <w:rPr>
+                <w:sz w:val="20"/>
+              </w:rPr>
+              <w:t>Git snapshot 424cf33 held the original Android interface and local search foundation in a ZIP.</w:t>
+            </w:r>
+          </w:p>
+        </w:tc>
+        <w:tc>
+          <w:tcPr>
+            <w:tcW w:type="dxa" w:w="4320"/>
+          </w:tcPr>
+          <w:p>
+            <w:pPr>
+              <w:spacing w:after="120" w:before="120"/>
+            </w:pPr>
+            <w:r>
+              <w:rPr>
+                <w:sz w:val="20"/>
+              </w:rPr>
+              <w:t>The same repository and native search foundation continue; a React Native shell and native editing workflows were added.</w:t>
+            </w:r>
+          </w:p>
+        </w:tc>
+      </w:tr>
+      <w:tr>
+        <w:trPr>
+          <w:cantSplit/>
+        </w:trPr>
+        <w:tc>
+          <w:tcPr>
+            <w:tcW w:type="dxa" w:w="1584"/>
+          </w:tcPr>
+          <w:p>
+            <w:pPr>
+              <w:spacing w:after="120" w:before="120"/>
+            </w:pPr>
+            <w:r>
+              <w:rPr>
+                <w:sz w:val="20"/>
+              </w:rPr>
+              <w:t>Home and offline entry</w:t>
+            </w:r>
+          </w:p>
+        </w:tc>
+        <w:tc>
+          <w:tcPr>
+            <w:tcW w:type="dxa" w:w="4032"/>
+          </w:tcPr>
+          <w:p>
+            <w:pPr>
+              <w:spacing w:after="120" w:before="120"/>
+            </w:pPr>
+            <w:r>
+              <w:rPr>
+                <w:sz w:val="20"/>
+              </w:rPr>
+              <w:t>Previous shared Home focused on search; the guest screen used stacked dark buttons.</w:t>
+            </w:r>
+          </w:p>
+        </w:tc>
+        <w:tc>
+          <w:tcPr>
+            <w:tcW w:type="dxa" w:w="4320"/>
+          </w:tcPr>
+          <w:p>
+            <w:pPr>
+              <w:spacing w:after="120" w:before="120"/>
+            </w:pPr>
+            <w:r>
+              <w:rPr>
+                <w:sz w:val="20"/>
+              </w:rPr>
+              <w:t>Home has direct Android editor cards. Guests see a matching white grid for drawing, blank creation and local editing.</w:t>
+            </w:r>
+          </w:p>
+        </w:tc>
+      </w:tr>
+      <w:tr>
+        <w:trPr>
+          <w:cantSplit/>
+        </w:trPr>
+        <w:tc>
+          <w:tcPr>
+            <w:tcW w:type="dxa" w:w="1584"/>
+          </w:tcPr>
+          <w:p>
+            <w:pPr>
+              <w:spacing w:after="120" w:before="120"/>
+            </w:pPr>
+            <w:r>
+              <w:rPr>
+                <w:sz w:val="20"/>
+              </w:rPr>
+              <w:t>Photo editing</w:t>
+            </w:r>
+          </w:p>
+        </w:tc>
+        <w:tc>
+          <w:tcPr>
+            <w:tcW w:type="dxa" w:w="4032"/>
+          </w:tcPr>
+          <w:p>
+            <w:pPr>
+              <w:spacing w:after="120" w:before="120"/>
+            </w:pPr>
+            <w:r>
+              <w:rPr>
+                <w:sz w:val="20"/>
+              </w:rPr>
+              <w:t>Earlier foundation did not contain this cumulative native finishing toolset.</w:t>
+            </w:r>
+          </w:p>
+        </w:tc>
+        <w:tc>
+          <w:tcPr>
+            <w:tcW w:type="dxa" w:w="4320"/>
+          </w:tcPr>
+          <w:p>
+            <w:pPr>
+              <w:spacing w:after="120" w:before="120"/>
+            </w:pPr>
+            <w:r>
+              <w:rPr>
+                <w:sz w:val="20"/>
+              </w:rPr>
+              <w:t>Framing, tone/color, curves, local light, person tools, OCR, text, saved looks and protected image exports.</w:t>
+            </w:r>
+          </w:p>
+        </w:tc>
+      </w:tr>
+      <w:tr>
+        <w:trPr>
+          <w:cantSplit/>
+        </w:trPr>
+        <w:tc>
+          <w:tcPr>
+            <w:tcW w:type="dxa" w:w="1584"/>
+          </w:tcPr>
+          <w:p>
+            <w:pPr>
+              <w:spacing w:after="120" w:before="120"/>
+            </w:pPr>
+            <w:r>
+              <w:rPr>
+                <w:sz w:val="20"/>
+              </w:rPr>
+              <w:t>Video editing</w:t>
+            </w:r>
+          </w:p>
+        </w:tc>
+        <w:tc>
+          <w:tcPr>
+            <w:tcW w:type="dxa" w:w="4032"/>
+          </w:tcPr>
+          <w:p>
+            <w:pPr>
+              <w:spacing w:after="120" w:before="120"/>
+            </w:pPr>
+            <w:r>
+              <w:rPr>
+                <w:sz w:val="20"/>
+              </w:rPr>
+              <w:t>A gallery/search foundation preceded the current native timeline work.</w:t>
+            </w:r>
+          </w:p>
+        </w:tc>
+        <w:tc>
+          <w:tcPr>
+            <w:tcW w:type="dxa" w:w="4320"/>
+          </w:tcPr>
+          <w:p>
+            <w:pPr>
+              <w:spacing w:after="120" w:before="120"/>
+            </w:pPr>
+            <w:r>
+              <w:rPr>
+                <w:sz w:val="20"/>
+              </w:rPr>
+              <w:t>Multiple sources, clip operations, speed, color, framing, titles, music, manual captions/SRT and protected video/audio exports.</w:t>
+            </w:r>
+          </w:p>
+        </w:tc>
+      </w:tr>
+      <w:tr>
+        <w:trPr>
+          <w:cantSplit/>
+        </w:trPr>
+        <w:tc>
+          <w:tcPr>
+            <w:tcW w:type="dxa" w:w="1584"/>
+          </w:tcPr>
+          <w:p>
+            <w:pPr>
+              <w:spacing w:after="120" w:before="120"/>
+            </w:pPr>
+            <w:r>
+              <w:rPr>
+                <w:sz w:val="20"/>
+              </w:rPr>
+              <w:t>Creation</w:t>
+            </w:r>
+          </w:p>
+        </w:tc>
+        <w:tc>
+          <w:tcPr>
+            <w:tcW w:type="dxa" w:w="4032"/>
+          </w:tcPr>
+          <w:p>
+            <w:pPr>
+              <w:spacing w:after="120" w:before="120"/>
+            </w:pPr>
+            <w:r>
+              <w:rPr>
+                <w:sz w:val="20"/>
+              </w:rPr>
+              <w:t>Earlier app focused on existing media.</w:t>
+            </w:r>
+          </w:p>
+        </w:tc>
+        <w:tc>
+          <w:tcPr>
+            <w:tcW w:type="dxa" w:w="4320"/>
+          </w:tcPr>
+          <w:p>
+            <w:pPr>
+              <w:spacing w:after="120" w:before="120"/>
+            </w:pPr>
+            <w:r>
+              <w:rPr>
+                <w:sz w:val="20"/>
+              </w:rPr>
+              <w:t>Blank images and offline drawing with one editable draft; no generative image or video engine.</w:t>
+            </w:r>
+          </w:p>
+        </w:tc>
+      </w:tr>
+      <w:tr>
+        <w:trPr>
+          <w:cantSplit/>
+        </w:trPr>
+        <w:tc>
+          <w:tcPr>
+            <w:tcW w:type="dxa" w:w="1584"/>
+          </w:tcPr>
+          <w:p>
+            <w:pPr>
+              <w:spacing w:after="120" w:before="120"/>
+            </w:pPr>
+            <w:r>
+              <w:rPr>
+                <w:sz w:val="20"/>
+              </w:rPr>
+              <w:t>Recent feature build</w:t>
+            </w:r>
+          </w:p>
+        </w:tc>
+        <w:tc>
+          <w:tcPr>
+            <w:tcW w:type="dxa" w:w="4032"/>
+          </w:tcPr>
+          <w:p>
+            <w:pPr>
+              <w:spacing w:after="120" w:before="120"/>
+            </w:pPr>
+            <w:r>
+              <w:rPr>
+                <w:sz w:val="20"/>
+              </w:rPr>
+              <w:t>358e0c6 added montage building and script captions.</w:t>
+            </w:r>
+          </w:p>
+        </w:tc>
+        <w:tc>
+          <w:tcPr>
+            <w:tcW w:type="dxa" w:w="4320"/>
+          </w:tcPr>
+          <w:p>
+            <w:pPr>
+              <w:spacing w:after="120" w:before="120"/>
+            </w:pPr>
+            <w:r>
+              <w:rPr>
+                <w:sz w:val="20"/>
+              </w:rPr>
+              <w:t>Both are retained. Today’s increment redesigns presentation and entry points, adding zero new editing engines.</w:t>
+            </w:r>
+          </w:p>
+        </w:tc>
+      </w:tr>
+      <w:tr>
+        <w:trPr>
+          <w:cantSplit/>
+        </w:trPr>
+        <w:tc>
+          <w:tcPr>
+            <w:tcW w:type="dxa" w:w="1584"/>
+          </w:tcPr>
+          <w:p>
+            <w:pPr>
+              <w:spacing w:after="120" w:before="120"/>
+            </w:pPr>
+            <w:r>
+              <w:rPr>
+                <w:sz w:val="20"/>
+              </w:rPr>
+              <w:t>Saving and reliability</w:t>
+            </w:r>
+          </w:p>
+        </w:tc>
+        <w:tc>
+          <w:tcPr>
+            <w:tcW w:type="dxa" w:w="4032"/>
+          </w:tcPr>
+          <w:p>
+            <w:pPr>
+              <w:spacing w:after="120" w:before="120"/>
+            </w:pPr>
+            <w:r>
+              <w:rPr>
+                <w:sz w:val="20"/>
+              </w:rPr>
+              <w:t>Earlier checkpoints had narrower recovery and source-only project work.</w:t>
+            </w:r>
+          </w:p>
+        </w:tc>
+        <w:tc>
+          <w:tcPr>
+            <w:tcW w:type="dxa" w:w="4320"/>
+          </w:tcPr>
+          <w:p>
+            <w:pPr>
+              <w:spacing w:after="120" w:before="120"/>
+            </w:pPr>
+            <w:r>
+              <w:rPr>
+                <w:sz w:val="20"/>
+              </w:rPr>
+              <w:t>Local guest video saves, isolated account drafts, bounded recovery, undo/redo and import/export safeguards.</w:t>
+            </w:r>
+          </w:p>
+        </w:tc>
+      </w:tr>
+      <w:tr>
+        <w:trPr>
+          <w:cantSplit/>
+        </w:trPr>
+        <w:tc>
+          <w:tcPr>
+            <w:tcW w:type="dxa" w:w="1584"/>
+          </w:tcPr>
+          <w:p>
+            <w:pPr>
+              <w:spacing w:after="120" w:before="120"/>
+            </w:pPr>
+            <w:r>
+              <w:rPr>
+                <w:sz w:val="20"/>
+              </w:rPr>
+              <w:t>Project organization</w:t>
+            </w:r>
+          </w:p>
+        </w:tc>
+        <w:tc>
+          <w:tcPr>
+            <w:tcW w:type="dxa" w:w="4032"/>
+          </w:tcPr>
+          <w:p>
+            <w:pPr>
+              <w:spacing w:after="120" w:before="120"/>
+            </w:pPr>
+            <w:r>
+              <w:rPr>
+                <w:sz w:val="20"/>
+              </w:rPr>
+              <w:t>Reports and references accumulated at the top level.</w:t>
+            </w:r>
+          </w:p>
+        </w:tc>
+        <w:tc>
+          <w:tcPr>
+            <w:tcW w:type="dxa" w:w="4320"/>
+          </w:tcPr>
+          <w:p>
+            <w:pPr>
+              <w:spacing w:after="120" w:before="120"/>
+            </w:pPr>
+            <w:r>
+              <w:rPr>
+                <w:sz w:val="20"/>
+              </w:rPr>
+              <w:t>Clear repository home, current guide, archived older reports, feature register, handoff and Obsidian notes.</w:t>
+            </w:r>
+          </w:p>
+        </w:tc>
+      </w:tr>
+    </w:tbl>
+    <w:p>
+      <w:pPr>
+        <w:pStyle w:val="Heading2"/>
+      </w:pPr>
+      <w:r>
+        <w:t>What the changes let you make</w:t>
+      </w:r>
+    </w:p>
+    <w:p>
+      <w:r>
+        <w:t>A short recap from a handful of recordings. A captioned explanation of a product. A cover built from a drawing and finished photo. A set of images with a shared look. An audio extract from an edited video. These are intended workflows built from the implemented tools; final media quality still needs phone acceptance.</w:t>
+      </w:r>
+    </w:p>
+    <w:p>
+      <w:r>
+        <w:br w:type="page"/>
+      </w:r>
+    </w:p>
+    <w:p>
+      <w:pPr>
+        <w:pStyle w:val="Heading1"/>
+      </w:pPr>
+      <w:r>
+        <w:t>Make a classical portrait study</w:t>
+      </w:r>
+    </w:p>
+    <w:p>
+      <w:r>
+        <w:t>A practical exercise inspired by the Mona Lisa. The current app can help you frame, finish or manually sketch a portrait. It cannot generate a Renaissance painting or rig a face from a prompt.</w:t>
+      </w:r>
+    </w:p>
+    <w:tbl>
+      <w:tblPr>
+        <w:tblW w:type="auto" w:w="0"/>
+        <w:tblLayout w:type="fixed"/>
+        <w:tblLook w:firstColumn="1" w:firstRow="1" w:lastColumn="0" w:lastRow="0" w:noHBand="0" w:noVBand="1" w:val="04A0"/>
+      </w:tblPr>
+      <w:tblGrid>
+        <w:gridCol w:w="5040"/>
+        <w:gridCol w:w="5040"/>
+      </w:tblGrid>
+      <w:tr>
+        <w:tc>
+          <w:tcPr>
+            <w:tcW w:type="dxa" w:w="3600"/>
+          </w:tcPr>
+          <w:p>
+            <w:r>
+              <w:drawing>
+                <wp:inline xmlns:a="http://schemas.openxmlformats.org/drawingml/2006/main" xmlns:pic="http://schemas.openxmlformats.org/drawingml/2006/picture">
+                  <wp:extent cx="1920240" cy="2862358"/>
+                  <wp:docPr id="13" name="Picture 13"/>
+                  <wp:cNvGraphicFramePr>
+                    <a:graphicFrameLocks noChangeAspect="1"/>
+                  </wp:cNvGraphicFramePr>
+                  <a:graphic>
+                    <a:graphicData uri="http://schemas.openxmlformats.org/drawingml/2006/picture">
+                      <pic:pic>
+                        <pic:nvPicPr>
+                          <pic:cNvPr id="0" name="mona-lisa-reference.jpg"/>
+                          <pic:cNvPicPr/>
+                        </pic:nvPicPr>
+                        <pic:blipFill>
+                          <a:blip r:embed="rId21"/>
+                          <a:stretch>
+                            <a:fillRect/>
+                          </a:stretch>
+                        </pic:blipFill>
+                        <pic:spPr>
+                          <a:xfrm>
+                            <a:off x="0" y="0"/>
+                            <a:ext cx="1920240" cy="2862358"/>
+                          </a:xfrm>
+                          <a:prstGeom prst="rect"/>
+                        </pic:spPr>
+                      </pic:pic>
+                    </a:graphicData>
+                  </a:graphic>
+                </wp:inline>
+              </w:drawing>
+            </w:r>
+          </w:p>
+          <w:p>
+            <w:pPr>
+              <w:pStyle w:val="Caption"/>
+            </w:pPr>
+            <w:r>
+              <w:t>Reference painting, not app output. Leonardo da Vinci; C2RMF reproduction; retouched by Dcoetzee. Wikimedia Commons records public-domain status.</w:t>
+            </w:r>
+          </w:p>
+        </w:tc>
+        <w:tc>
+          <w:tcPr>
+            <w:tcW w:type="dxa" w:w="6336"/>
+          </w:tcPr>
+          <w:p>
+            <w:r/>
+          </w:p>
+          <w:p>
+            <w:pPr>
+              <w:spacing w:after="180"/>
+            </w:pPr>
+            <w:r>
+              <w:rPr>
+                <w:b/>
+              </w:rPr>
+              <w:t>1  Choose a starting image</w:t>
+              <w:br/>
+            </w:r>
+            <w:r>
+              <w:t>Use a portrait you own, or download the public-domain reference for practice. Start Edit without an account, then Edit a photo.</w:t>
+            </w:r>
+          </w:p>
+          <w:p>
+            <w:pPr>
+              <w:spacing w:after="180"/>
+            </w:pPr>
+            <w:r>
+              <w:rPr>
+                <w:b/>
+              </w:rPr>
+              <w:t>2  Set the composition</w:t>
+              <w:br/>
+            </w:r>
+            <w:r>
+              <w:t>Choose a portrait crop. Keep room around the head and hands. Rotate only if needed; the original remains unchanged.</w:t>
+            </w:r>
+          </w:p>
+          <w:p>
+            <w:pPr>
+              <w:spacing w:after="180"/>
+            </w:pPr>
+            <w:r>
+              <w:rPr>
+                <w:b/>
+              </w:rPr>
+              <w:t>3  Shape the light</w:t>
+              <w:br/>
+            </w:r>
+            <w:r>
+              <w:t>Start with small exposure and contrast changes. Review shadows and highlights so the face remains readable without flattening the background.</w:t>
+            </w:r>
+          </w:p>
+          <w:p>
+            <w:pPr>
+              <w:spacing w:after="180"/>
+            </w:pPr>
+            <w:r>
+              <w:rPr>
+                <w:b/>
+              </w:rPr>
+              <w:t>4  Set the mood</w:t>
+              <w:br/>
+            </w:r>
+            <w:r>
+              <w:t>Try a slightly warmer white balance and restrained saturation. Use a gentle curve or vignette if it helps the composition. Compare with the original frequently.</w:t>
+            </w:r>
+          </w:p>
+          <w:p>
+            <w:pPr>
+              <w:spacing w:after="180"/>
+            </w:pPr>
+            <w:r>
+              <w:rPr>
+                <w:b/>
+              </w:rPr>
+              <w:t>5  Keep and reuse the look</w:t>
+              <w:br/>
+            </w:r>
+            <w:r>
+              <w:t>Save the global adjustments as a named photo look. Export a JPEG copy for a portrait study, or PNG if transparency matters.</w:t>
+            </w:r>
+          </w:p>
+        </w:tc>
+      </w:tr>
+    </w:tbl>
+    <w:p>
+      <w:pPr>
+        <w:pStyle w:val="Heading2"/>
+      </w:pPr>
+      <w:r>
+        <w:t>If you want to draw instead</w:t>
+      </w:r>
+    </w:p>
+    <w:p>
+      <w:r>
+        <w:t>Open Draw an image and sketch a simple seated portrait using freehand lines and shapes. Build the silhouette, face and background in stages, then save the editable local draft. Use image sends a PNG to the photo editor for finishing. This is manual vector drawing; a full painterly brush engine, advanced layer system and automatic posing are not implemented.</w:t>
       </w:r>
     </w:p>
     <w:p>
@@ -442,17 +2085,370 @@
         <w:pStyle w:val="Heading2"/>
       </w:pPr>
       <w:r>
-        <w:t>What we checked for this update</w:t>
+        <w:t>Turn the study into a short presentation</w:t>
       </w:r>
     </w:p>
     <w:p>
       <w:r>
-        <w:t>The complete ARM64 Android internal build passed. All 130 native Android unit tests and 112 shared Android unit tests passed fresh. The 60 React Native tests, TypeScript and lint passed; lint retains 36 existing warnings and no errors. Android instrumentation compiled but was not run on a device. The packaged source, drawing assets, models, signature and ZIP alignment were checked.</w:t>
+        <w:t>Use your exported image as a cover outside the video editor, or record a few clips of your process and import those videos. Arrange them, build a short montage, add a title and paste an explanation through Script to captions. Preview timing and export a copy. Photo-to-video animation and still-image timeline clips are not currently claimed.</w:t>
+      </w:r>
+    </w:p>
+    <w:p>
+      <w:pPr>
+        <w:pStyle w:val="Caption"/>
+      </w:pPr>
+      <w:r>
+        <w:t>Reference and rights record: https://commons.wikimedia.org/wiki/File:Mona_Lisa,_by_Leonardo_da_Vinci,_from_C2RMF_retouched.jpg</w:t>
+      </w:r>
+    </w:p>
+    <w:p>
+      <w:pPr>
+        <w:pStyle w:val="Caption"/>
+      </w:pPr>
+      <w:r>
+        <w:t>An accompanying preview-tour video, if present beside this report, shows the labelled HTML views. It is not a recording of native editing or a generated-art demonstration.</w:t>
       </w:r>
     </w:p>
     <w:p>
       <w:r>
-        <w:t>This is an internal build using the public debug certificate. No Android phone was available, so installation, real media output, sound synchronization, touch behavior, memory use and lifecycle handling still need device testing. Automated success does not replace those checks.</w:t>
+        <w:br w:type="page"/>
+      </w:r>
+    </w:p>
+    <w:p>
+      <w:pPr>
+        <w:pStyle w:val="Heading1"/>
+      </w:pPr>
+      <w:r>
+        <w:t>What is verified and what is next</w:t>
+      </w:r>
+    </w:p>
+    <w:p>
+      <w:r>
+        <w:t>The Android candidate is built for internal testing. It uses the public debug certificate and is not a store release. The app has more working tools, but automated success alone does not prove the complete phone experience.</w:t>
+      </w:r>
+    </w:p>
+    <w:tbl>
+      <w:tblPr>
+        <w:tblW w:type="auto" w:w="0"/>
+        <w:tblLayout w:type="fixed"/>
+        <w:tblLook w:firstColumn="1" w:firstRow="1" w:lastColumn="0" w:lastRow="0" w:noHBand="0" w:noVBand="1" w:val="04A0"/>
+      </w:tblPr>
+      <w:tblGrid>
+        <w:gridCol w:w="5040"/>
+        <w:gridCol w:w="5040"/>
+      </w:tblGrid>
+      <w:tr>
+        <w:trPr>
+          <w:cantSplit/>
+        </w:trPr>
+        <w:tc>
+          <w:tcPr>
+            <w:tcW w:type="dxa" w:w="3168"/>
+            <w:shd w:fill="F1F1F1"/>
+          </w:tcPr>
+          <w:p>
+            <w:pPr>
+              <w:spacing w:after="120" w:before="120"/>
+            </w:pPr>
+            <w:r>
+              <w:rPr>
+                <w:b/>
+                <w:sz w:val="20"/>
+              </w:rPr>
+              <w:t>Check</w:t>
+            </w:r>
+          </w:p>
+        </w:tc>
+        <w:tc>
+          <w:tcPr>
+            <w:tcW w:type="dxa" w:w="6768"/>
+            <w:shd w:fill="F1F1F1"/>
+          </w:tcPr>
+          <w:p>
+            <w:pPr>
+              <w:spacing w:after="120" w:before="120"/>
+            </w:pPr>
+            <w:r>
+              <w:rPr>
+                <w:b/>
+                <w:sz w:val="20"/>
+              </w:rPr>
+              <w:t>Result</w:t>
+            </w:r>
+          </w:p>
+        </w:tc>
+      </w:tr>
+      <w:tr>
+        <w:trPr>
+          <w:cantSplit/>
+        </w:trPr>
+        <w:tc>
+          <w:tcPr>
+            <w:tcW w:type="dxa" w:w="3168"/>
+          </w:tcPr>
+          <w:p>
+            <w:pPr>
+              <w:spacing w:after="120" w:before="120"/>
+            </w:pPr>
+            <w:r>
+              <w:rPr>
+                <w:sz w:val="20"/>
+              </w:rPr>
+              <w:t>Native Android JVM tests</w:t>
+            </w:r>
+          </w:p>
+        </w:tc>
+        <w:tc>
+          <w:tcPr>
+            <w:tcW w:type="dxa" w:w="6768"/>
+          </w:tcPr>
+          <w:p>
+            <w:pPr>
+              <w:spacing w:after="120" w:before="120"/>
+            </w:pPr>
+            <w:r>
+              <w:rPr>
+                <w:sz w:val="20"/>
+              </w:rPr>
+              <w:t>130 passed freshly, including the ten story-tool tests.</w:t>
+            </w:r>
+          </w:p>
+        </w:tc>
+      </w:tr>
+      <w:tr>
+        <w:trPr>
+          <w:cantSplit/>
+        </w:trPr>
+        <w:tc>
+          <w:tcPr>
+            <w:tcW w:type="dxa" w:w="3168"/>
+          </w:tcPr>
+          <w:p>
+            <w:pPr>
+              <w:spacing w:after="120" w:before="120"/>
+            </w:pPr>
+            <w:r>
+              <w:rPr>
+                <w:sz w:val="20"/>
+              </w:rPr>
+              <w:t>Shared Android JVM tests</w:t>
+            </w:r>
+          </w:p>
+        </w:tc>
+        <w:tc>
+          <w:tcPr>
+            <w:tcW w:type="dxa" w:w="6768"/>
+          </w:tcPr>
+          <w:p>
+            <w:pPr>
+              <w:spacing w:after="120" w:before="120"/>
+            </w:pPr>
+            <w:r>
+              <w:rPr>
+                <w:sz w:val="20"/>
+              </w:rPr>
+              <w:t>112 passed freshly.</w:t>
+            </w:r>
+          </w:p>
+        </w:tc>
+      </w:tr>
+      <w:tr>
+        <w:trPr>
+          <w:cantSplit/>
+        </w:trPr>
+        <w:tc>
+          <w:tcPr>
+            <w:tcW w:type="dxa" w:w="3168"/>
+          </w:tcPr>
+          <w:p>
+            <w:pPr>
+              <w:spacing w:after="120" w:before="120"/>
+            </w:pPr>
+            <w:r>
+              <w:rPr>
+                <w:sz w:val="20"/>
+              </w:rPr>
+              <w:t>React Native, TypeScript and lint</w:t>
+            </w:r>
+          </w:p>
+        </w:tc>
+        <w:tc>
+          <w:tcPr>
+            <w:tcW w:type="dxa" w:w="6768"/>
+          </w:tcPr>
+          <w:p>
+            <w:pPr>
+              <w:spacing w:after="120" w:before="120"/>
+            </w:pPr>
+            <w:r>
+              <w:rPr>
+                <w:sz w:val="20"/>
+              </w:rPr>
+              <w:t>60 tests in 11 suites passed; typecheck passed; lint has no errors and 36 existing warnings.</w:t>
+            </w:r>
+          </w:p>
+        </w:tc>
+      </w:tr>
+      <w:tr>
+        <w:trPr>
+          <w:cantSplit/>
+        </w:trPr>
+        <w:tc>
+          <w:tcPr>
+            <w:tcW w:type="dxa" w:w="3168"/>
+          </w:tcPr>
+          <w:p>
+            <w:pPr>
+              <w:spacing w:after="120" w:before="120"/>
+            </w:pPr>
+            <w:r>
+              <w:rPr>
+                <w:sz w:val="20"/>
+              </w:rPr>
+              <w:t>Android instrumentation</w:t>
+            </w:r>
+          </w:p>
+        </w:tc>
+        <w:tc>
+          <w:tcPr>
+            <w:tcW w:type="dxa" w:w="6768"/>
+          </w:tcPr>
+          <w:p>
+            <w:pPr>
+              <w:spacing w:after="120" w:before="120"/>
+            </w:pPr>
+            <w:r>
+              <w:rPr>
+                <w:sz w:val="20"/>
+              </w:rPr>
+              <w:t>Compiled only; not executed on a device.</w:t>
+            </w:r>
+          </w:p>
+        </w:tc>
+      </w:tr>
+      <w:tr>
+        <w:trPr>
+          <w:cantSplit/>
+        </w:trPr>
+        <w:tc>
+          <w:tcPr>
+            <w:tcW w:type="dxa" w:w="3168"/>
+          </w:tcPr>
+          <w:p>
+            <w:pPr>
+              <w:spacing w:after="120" w:before="120"/>
+            </w:pPr>
+            <w:r>
+              <w:rPr>
+                <w:sz w:val="20"/>
+              </w:rPr>
+              <w:t>Complete ARM64 internal APK</w:t>
+            </w:r>
+          </w:p>
+        </w:tc>
+        <w:tc>
+          <w:tcPr>
+            <w:tcW w:type="dxa" w:w="6768"/>
+          </w:tcPr>
+          <w:p>
+            <w:pPr>
+              <w:spacing w:after="120" w:before="120"/>
+            </w:pPr>
+            <w:r>
+              <w:rPr>
+                <w:sz w:val="20"/>
+              </w:rPr>
+              <w:t>Build passed; frozen app source, bundled assets/models, private activities/provider, signature and ZIP alignment verified.</w:t>
+            </w:r>
+          </w:p>
+        </w:tc>
+      </w:tr>
+      <w:tr>
+        <w:trPr>
+          <w:cantSplit/>
+        </w:trPr>
+        <w:tc>
+          <w:tcPr>
+            <w:tcW w:type="dxa" w:w="3168"/>
+          </w:tcPr>
+          <w:p>
+            <w:pPr>
+              <w:spacing w:after="120" w:before="120"/>
+            </w:pPr>
+            <w:r>
+              <w:rPr>
+                <w:sz w:val="20"/>
+              </w:rPr>
+              <w:t>Preview</w:t>
+            </w:r>
+          </w:p>
+        </w:tc>
+        <w:tc>
+          <w:tcPr>
+            <w:tcW w:type="dxa" w:w="6768"/>
+          </w:tcPr>
+          <w:p>
+            <w:pPr>
+              <w:spacing w:after="120" w:before="120"/>
+            </w:pPr>
+            <w:r>
+              <w:rPr>
+                <w:sz w:val="20"/>
+              </w:rPr>
+              <w:t>18 states checked with local headless HTML rendering; editor routing, dialogs and narrow viewport checked. Images are component adaptations or labelled source illustrations.</w:t>
+            </w:r>
+          </w:p>
+        </w:tc>
+      </w:tr>
+      <w:tr>
+        <w:trPr>
+          <w:cantSplit/>
+        </w:trPr>
+        <w:tc>
+          <w:tcPr>
+            <w:tcW w:type="dxa" w:w="3168"/>
+          </w:tcPr>
+          <w:p>
+            <w:pPr>
+              <w:spacing w:after="120" w:before="120"/>
+            </w:pPr>
+            <w:r>
+              <w:rPr>
+                <w:sz w:val="20"/>
+              </w:rPr>
+              <w:t>Illustrated report</w:t>
+            </w:r>
+          </w:p>
+        </w:tc>
+        <w:tc>
+          <w:tcPr>
+            <w:tcW w:type="dxa" w:w="6768"/>
+          </w:tcPr>
+          <w:p>
+            <w:pPr>
+              <w:spacing w:after="120" w:before="120"/>
+            </w:pPr>
+            <w:r>
+              <w:rPr>
+                <w:sz w:val="20"/>
+              </w:rPr>
+              <w:t>Rendered and visually inspected before delivery. Screen images are embedded in this Word document.</w:t>
+            </w:r>
+          </w:p>
+        </w:tc>
+      </w:tr>
+    </w:tbl>
+    <w:p>
+      <w:pPr>
+        <w:pStyle w:val="Heading2"/>
+      </w:pPr>
+      <w:r>
+        <w:t>Physical testing comes next</w:t>
+      </w:r>
+    </w:p>
+    <w:p>
+      <w:r>
+        <w:t>No Android phone is available here. Installation, touch and large-text behavior, permissions, photo pixels, video order, sound synchronization, saved copies, drawing storage and lifecycle recovery remain unverified on a real device. A tester should complete an edit, save and reopen it, export a copy and inspect the result before a public release.</w:t>
       </w:r>
     </w:p>
     <w:p>
@@ -460,12 +2456,12 @@
         <w:pStyle w:val="Heading2"/>
       </w:pPr>
       <w:r>
-        <w:t>What is still unfinished</w:t>
+        <w:t>Still outside the working feature set</w:t>
       </w:r>
     </w:p>
     <w:p>
       <w:r>
-        <w:t>AI image and video generation, automatic speech captions, generative fill, advanced layers and compositing, rigging, tracking, keyframes, nodes, 3D and code execution remain unfinished. Native iOS editors and a working iOS release are not verified. Hosted accounts, billing, private signing and public store distribution also remain open.</w:t>
+        <w:t>AI image/video generation, speech transcription, generative fill, arbitrary layers and compositing, overlapping transitions, tracking, rigging, keyframes, nodes, 3D and code execution remain unfinished. Native iOS editors and a working iOS release are not verified. Hosted accounts, billing, private signing and store distribution remain open.</w:t>
       </w:r>
     </w:p>
     <w:p>
@@ -473,24 +2469,33 @@
         <w:pStyle w:val="Heading2"/>
       </w:pPr>
       <w:r>
-        <w:t>Try the Android candidate</w:t>
+        <w:t>Where to find the current work</w:t>
       </w:r>
     </w:p>
     <w:p>
       <w:r>
-        <w:t>Choose Edit without an account. Open a photo or video from Files, or start Draw an image. In the video editor, find Build a montage under Project and Script to captions under Titles; both are also in the inspector. Preview your work and export a new copy. Keep your original media and check the exported result.</w:t>
+        <w:t>Repository: github.com/honrablecom-source/Honorable-mobile-app</w:t>
+        <w:br/>
+        <w:t>Branch: codex/android-internal-readiness · Review: pull request 1</w:t>
+        <w:br/>
+        <w:t>Preview: docs/ui/Honorable-current-preview.html</w:t>
+        <w:br/>
+        <w:t>Build and acceptance notes: docs/HOME_STUDIOS_READINESS.md</w:t>
       </w:r>
     </w:p>
     <w:p>
+      <w:pPr>
+        <w:pStyle w:val="Caption"/>
+      </w:pPr>
       <w:r>
-        <w:t>Current technical evidence: docs/STORY_TOOLS_READINESS.md. Source: github.com/honrablecom-source/Honorable-mobile-app, branch codex/android-internal-readiness, pull request 1. Caveman, Rust RTK, offline Headroom and scoped Repomix support efficient development; they do not guarantee a particular credit saving.</w:t>
+        <w:t>Development remains solo, without computer-use tools. Caveman, Rust RTK, scoped Repomix and offline Headroom are configured and checked. Their measured output reduction is not a promise of conversation-credit savings.</w:t>
       </w:r>
     </w:p>
     <w:sectPr>
       <w:headerReference w:type="default" r:id="rId9"/>
       <w:footerReference w:type="default" r:id="rId10"/>
       <w:pgSz w:w="12240" w:h="15840"/>
-      <w:pgMar w:top="1008" w:right="1152" w:bottom="1008" w:left="1152" w:header="720" w:footer="720" w:gutter="0"/>
+      <w:pgMar w:top="936" w:right="1080" w:bottom="936" w:left="1080" w:header="720" w:footer="720" w:gutter="0"/>
       <w:cols w:space="720"/>
       <w:docGrid w:linePitch="360"/>
     </w:sectPr>
@@ -505,7 +2510,10 @@
       <w:pStyle w:val="Footer"/>
     </w:pPr>
     <w:r>
-      <w:t xml:space="preserve">October 24 2026    •    Internal Android testing    /    </w:t>
+      <w:rPr>
+        <w:sz w:val="18"/>
+      </w:rPr>
+      <w:t xml:space="preserve">October 24 2026    ·    Android internal testing    /    </w:t>
     </w:r>
     <w:fldSimple w:instr="PAGE"/>
   </w:p>
@@ -516,10 +2524,13 @@
 <w:hdr xmlns:m="http://schemas.openxmlformats.org/officeDocument/2006/math" xmlns:mc="http://schemas.openxmlformats.org/markup-compatibility/2006" xmlns:mo="http://schemas.microsoft.com/office/mac/office/2008/main" xmlns:mv="urn:schemas-microsoft-com:mac:vml" xmlns:o="urn:schemas-microsoft-com:office:office" xmlns:r="http://schemas.openxmlformats.org/officeDocument/2006/relationships" xmlns:v="urn:schemas-microsoft-com:vml" xmlns:w10="urn:schemas-microsoft-com:office:word" xmlns:w14="http://schemas.microsoft.com/office/word/2010/wordml" xmlns:w="http://schemas.openxmlformats.org/wordprocessingml/2006/main" xmlns:wne="http://schemas.microsoft.com/office/word/2006/wordml" xmlns:wp14="http://schemas.microsoft.com/office/word/2010/wordprocessingDrawing" xmlns:wp="http://schemas.openxmlformats.org/drawingml/2006/wordprocessingDrawing" xmlns:wpc="http://schemas.microsoft.com/office/word/2010/wordprocessingCanvas" xmlns:wpg="http://schemas.microsoft.com/office/word/2010/wordprocessingGroup" xmlns:wpi="http://schemas.microsoft.com/office/word/2010/wordprocessingInk" xmlns:wps="http://schemas.microsoft.com/office/word/2010/wordprocessingShape" mc:Ignorable="w14 wp14">
   <w:p>
     <w:pPr>
-      <w:pStyle w:val="Caption"/>
+      <w:pStyle w:val="Header"/>
     </w:pPr>
     <w:r>
-      <w:t>HONORABLE   /   PRODUCT UPDATE</w:t>
+      <w:rPr>
+        <w:sz w:val="18"/>
+      </w:rPr>
+      <w:t>HONORABLE   /   THE APP AND WHAT CHANGED</w:t>
     </w:r>
   </w:p>
 </w:hdr>
@@ -889,7 +2900,7 @@
     <w:qFormat/>
     <w:rsid w:val="00FC693F"/>
     <w:pPr>
-      <w:spacing w:after="160" w:line="254" w:lineRule="auto"/>
+      <w:spacing w:after="140" w:line="250" w:lineRule="auto"/>
     </w:pPr>
     <w:rPr>
       <w:rFonts w:ascii="Calibri" w:hAnsi="Calibri"/>
@@ -960,7 +2971,7 @@
       <w:b/>
       <w:bCs/>
       <w:color w:val="000000"/>
-      <w:sz w:val="40"/>
+      <w:sz w:val="48"/>
       <w:szCs w:val="28"/>
     </w:rPr>
   </w:style>
@@ -1246,7 +3257,7 @@
       <w:color w:val="000000"/>
       <w:spacing w:val="5"/>
       <w:kern w:val="28"/>
-      <w:sz w:val="56"/>
+      <w:sz w:val="62"/>
       <w:szCs w:val="52"/>
     </w:rPr>
   </w:style>
@@ -1684,9 +3695,10 @@
       <w:spacing w:line="240" w:lineRule="auto"/>
     </w:pPr>
     <w:rPr>
+      <w:rFonts w:ascii="Calibri" w:hAnsi="Calibri"/>
       <w:b/>
       <w:bCs/>
-      <w:color w:val="000000"/>
+      <w:color w:val="606060"/>
       <w:sz w:val="18"/>
       <w:szCs w:val="18"/>
     </w:rPr>

</xml_diff>

<commit_message>
Add batched creative photo tools and verified Android release
</commit_message>
<xml_diff>
--- a/docs/releases/Honorable-Creative-Guide.docx
+++ b/docs/releases/Honorable-Creative-Guide.docx
@@ -2203,14 +2203,8 @@
             <w:tcW w:type="dxa" w:w="6768"/>
           </w:tcPr>
           <w:p>
-            <w:pPr>
-              <w:spacing w:after="120" w:before="120"/>
-            </w:pPr>
             <w:r>
-              <w:rPr>
-                <w:sz w:val="20"/>
-              </w:rPr>
-              <w:t>130 passed freshly, including the ten story-tool tests.</w:t>
+              <w:t>130 passed freshly.</w:t>
             </w:r>
           </w:p>
         </w:tc>
@@ -2240,14 +2234,8 @@
             <w:tcW w:type="dxa" w:w="6768"/>
           </w:tcPr>
           <w:p>
-            <w:pPr>
-              <w:spacing w:after="120" w:before="120"/>
-            </w:pPr>
             <w:r>
-              <w:rPr>
-                <w:sz w:val="20"/>
-              </w:rPr>
-              <w:t>112 passed freshly.</w:t>
+              <w:t>129 passed freshly, including the new creative and provenance checks.</w:t>
             </w:r>
           </w:p>
         </w:tc>
@@ -2388,14 +2376,8 @@
             <w:tcW w:type="dxa" w:w="6768"/>
           </w:tcPr>
           <w:p>
-            <w:pPr>
-              <w:spacing w:after="120" w:before="120"/>
-            </w:pPr>
             <w:r>
-              <w:rPr>
-                <w:sz w:val="20"/>
-              </w:rPr>
-              <w:t>18 states checked with local headless HTML rendering; editor routing, dialogs and narrow viewport checked. Images are component adaptations or labelled source illustrations.</w:t>
+              <w:t>Earlier preview: 18 HTML states checked for routing, dialogs and narrow viewports. Component adaptations and labelled source illustrations; the new native color controls are not yet shown.</w:t>
             </w:r>
           </w:p>
         </w:tc>
@@ -2476,11 +2458,11 @@
       <w:r>
         <w:t>Repository: github.com/honrablecom-source/Honorable-mobile-app</w:t>
         <w:br/>
-        <w:t>Branch: codex/android-internal-readiness · Review: pull request 1</w:t>
+        <w:t>Main branch contains the published release; executable/release.json records the matching source tree.</w:t>
         <w:br/>
         <w:t>Preview: docs/ui/Honorable-current-preview.html</w:t>
         <w:br/>
-        <w:t>Build and acceptance notes: docs/HOME_STUDIOS_READINESS.md</w:t>
+        <w:t>Build notes: docs/CREATIVE_COLOR_READINESS.md and docs/HOME_STUDIOS_READINESS.md</w:t>
       </w:r>
     </w:p>
     <w:p>
@@ -2489,6 +2471,450 @@
       </w:pPr>
       <w:r>
         <w:t>Development remains solo, without computer-use tools. Caveman, Rust RTK, scoped Repomix and offline Headroom are configured and checked. Their measured output reduction is not a promise of conversation-credit savings.</w:t>
+      </w:r>
+    </w:p>
+    <w:p>
+      <w:r>
+        <w:br w:type="page"/>
+      </w:r>
+    </w:p>
+    <w:p>
+      <w:pPr>
+        <w:pStyle w:val="Heading1"/>
+      </w:pPr>
+      <w:r>
+        <w:t>Creative color examples</w:t>
+      </w:r>
+    </w:p>
+    <w:p>
+      <w:r>
+        <w:t>Eight new local editing tools now share the existing photo editor. These examples use its actual compiled Kotlin color kernel.</w:t>
+      </w:r>
+    </w:p>
+    <w:p>
+      <w:pPr>
+        <w:jc w:val="center"/>
+      </w:pPr>
+      <w:r>
+        <w:drawing>
+          <wp:inline xmlns:a="http://schemas.openxmlformats.org/drawingml/2006/main" xmlns:pic="http://schemas.openxmlformats.org/drawingml/2006/picture">
+            <wp:extent cx="4114800" cy="6813467"/>
+            <wp:docPr id="14" name="Picture 14"/>
+            <wp:cNvGraphicFramePr>
+              <a:graphicFrameLocks noChangeAspect="1"/>
+            </wp:cNvGraphicFramePr>
+            <a:graphic>
+              <a:graphicData uri="http://schemas.openxmlformats.org/drawingml/2006/picture">
+                <pic:pic>
+                  <pic:nvPicPr>
+                    <pic:cNvPr id="0" name="creative-color-examples.png"/>
+                    <pic:cNvPicPr/>
+                  </pic:nvPicPr>
+                  <pic:blipFill>
+                    <a:blip r:embed="rId22"/>
+                    <a:stretch>
+                      <a:fillRect/>
+                    </a:stretch>
+                  </pic:blipFill>
+                  <pic:spPr>
+                    <a:xfrm>
+                      <a:off x="0" y="0"/>
+                      <a:ext cx="4114800" cy="6813467"/>
+                    </a:xfrm>
+                    <a:prstGeom prst="rect"/>
+                  </pic:spPr>
+                </pic:pic>
+              </a:graphicData>
+            </a:graphic>
+          </wp:inline>
+        </w:drawing>
+      </w:r>
+    </w:p>
+    <w:p>
+      <w:pPr>
+        <w:pStyle w:val="Caption"/>
+      </w:pPr>
+      <w:r>
+        <w:t>Algorithm illustrations using the credited public-domain Mona Lisa reference. These are not phone screenshots or AI-generated pictures.</w:t>
+      </w:r>
+    </w:p>
+    <w:p>
+      <w:r>
+        <w:br w:type="page"/>
+      </w:r>
+    </w:p>
+    <w:p>
+      <w:pPr>
+        <w:pStyle w:val="Heading1"/>
+      </w:pPr>
+      <w:r>
+        <w:t>Use the new photo tools</w:t>
+      </w:r>
+    </w:p>
+    <w:p>
+      <w:r>
+        <w:t>Open a photo, then choose Tools and Creative color. Adjust a tool and tap Apply. Cancel leaves the current photo unchanged.</w:t>
+      </w:r>
+    </w:p>
+    <w:tbl>
+      <w:tblPr>
+        <w:tblStyle w:val="TableGrid"/>
+        <w:tblW w:type="auto" w:w="0"/>
+        <w:tblLook w:firstColumn="1" w:firstRow="1" w:lastColumn="0" w:lastRow="0" w:noHBand="0" w:noVBand="1" w:val="04A0"/>
+      </w:tblPr>
+      <w:tblGrid>
+        <w:gridCol w:w="5040"/>
+        <w:gridCol w:w="5040"/>
+      </w:tblGrid>
+      <w:tr>
+        <w:tc>
+          <w:tcPr>
+            <w:tcW w:type="dxa" w:w="5040"/>
+          </w:tcPr>
+          <w:p>
+            <w:pPr>
+              <w:spacing w:after="100"/>
+            </w:pPr>
+            <w:r>
+              <w:rPr>
+                <w:sz w:val="20"/>
+              </w:rPr>
+              <w:t>Tool</w:t>
+            </w:r>
+          </w:p>
+        </w:tc>
+        <w:tc>
+          <w:tcPr>
+            <w:tcW w:type="dxa" w:w="5040"/>
+          </w:tcPr>
+          <w:p>
+            <w:pPr>
+              <w:spacing w:after="100"/>
+            </w:pPr>
+            <w:r>
+              <w:rPr>
+                <w:sz w:val="20"/>
+              </w:rPr>
+              <w:t>What you can do</w:t>
+            </w:r>
+          </w:p>
+        </w:tc>
+      </w:tr>
+      <w:tr>
+        <w:tc>
+          <w:tcPr>
+            <w:tcW w:type="dxa" w:w="5040"/>
+          </w:tcPr>
+          <w:p>
+            <w:pPr>
+              <w:spacing w:after="100"/>
+            </w:pPr>
+            <w:r>
+              <w:rPr>
+                <w:sz w:val="20"/>
+              </w:rPr>
+              <w:t>Vibrance</w:t>
+            </w:r>
+          </w:p>
+        </w:tc>
+        <w:tc>
+          <w:tcPr>
+            <w:tcW w:type="dxa" w:w="5040"/>
+          </w:tcPr>
+          <w:p>
+            <w:pPr>
+              <w:spacing w:after="100"/>
+            </w:pPr>
+            <w:r>
+              <w:rPr>
+                <w:sz w:val="20"/>
+              </w:rPr>
+              <w:t>Strengthen muted colors while protecting more saturated colors.</w:t>
+            </w:r>
+          </w:p>
+        </w:tc>
+      </w:tr>
+      <w:tr>
+        <w:tc>
+          <w:tcPr>
+            <w:tcW w:type="dxa" w:w="5040"/>
+          </w:tcPr>
+          <w:p>
+            <w:pPr>
+              <w:spacing w:after="100"/>
+            </w:pPr>
+            <w:r>
+              <w:rPr>
+                <w:sz w:val="20"/>
+              </w:rPr>
+              <w:t>Hue shift</w:t>
+            </w:r>
+          </w:p>
+        </w:tc>
+        <w:tc>
+          <w:tcPr>
+            <w:tcW w:type="dxa" w:w="5040"/>
+          </w:tcPr>
+          <w:p>
+            <w:pPr>
+              <w:spacing w:after="100"/>
+            </w:pPr>
+            <w:r>
+              <w:rPr>
+                <w:sz w:val="20"/>
+              </w:rPr>
+              <w:t>Rotate colors to explore a different palette.</w:t>
+            </w:r>
+          </w:p>
+        </w:tc>
+      </w:tr>
+      <w:tr>
+        <w:tc>
+          <w:tcPr>
+            <w:tcW w:type="dxa" w:w="5040"/>
+          </w:tcPr>
+          <w:p>
+            <w:pPr>
+              <w:spacing w:after="100"/>
+            </w:pPr>
+            <w:r>
+              <w:rPr>
+                <w:sz w:val="20"/>
+              </w:rPr>
+              <w:t>Matte fade</w:t>
+            </w:r>
+          </w:p>
+        </w:tc>
+        <w:tc>
+          <w:tcPr>
+            <w:tcW w:type="dxa" w:w="5040"/>
+          </w:tcPr>
+          <w:p>
+            <w:pPr>
+              <w:spacing w:after="100"/>
+            </w:pPr>
+            <w:r>
+              <w:rPr>
+                <w:sz w:val="20"/>
+              </w:rPr>
+              <w:t>Lift the darkest tones for softer blacks.</w:t>
+            </w:r>
+          </w:p>
+        </w:tc>
+      </w:tr>
+      <w:tr>
+        <w:tc>
+          <w:tcPr>
+            <w:tcW w:type="dxa" w:w="5040"/>
+          </w:tcPr>
+          <w:p>
+            <w:pPr>
+              <w:spacing w:after="100"/>
+            </w:pPr>
+            <w:r>
+              <w:rPr>
+                <w:sz w:val="20"/>
+              </w:rPr>
+              <w:t>Film grain</w:t>
+            </w:r>
+          </w:p>
+        </w:tc>
+        <w:tc>
+          <w:tcPr>
+            <w:tcW w:type="dxa" w:w="5040"/>
+          </w:tcPr>
+          <w:p>
+            <w:pPr>
+              <w:spacing w:after="100"/>
+            </w:pPr>
+            <w:r>
+              <w:rPr>
+                <w:sz w:val="20"/>
+              </w:rPr>
+              <w:t>Add stable monochrome texture.</w:t>
+            </w:r>
+          </w:p>
+        </w:tc>
+      </w:tr>
+      <w:tr>
+        <w:tc>
+          <w:tcPr>
+            <w:tcW w:type="dxa" w:w="5040"/>
+          </w:tcPr>
+          <w:p>
+            <w:pPr>
+              <w:spacing w:after="100"/>
+            </w:pPr>
+            <w:r>
+              <w:rPr>
+                <w:sz w:val="20"/>
+              </w:rPr>
+              <w:t>Posterize</w:t>
+            </w:r>
+          </w:p>
+        </w:tc>
+        <w:tc>
+          <w:tcPr>
+            <w:tcW w:type="dxa" w:w="5040"/>
+          </w:tcPr>
+          <w:p>
+            <w:pPr>
+              <w:spacing w:after="100"/>
+            </w:pPr>
+            <w:r>
+              <w:rPr>
+                <w:sz w:val="20"/>
+              </w:rPr>
+              <w:t>Reduce each channel to between two and sixteen levels.</w:t>
+            </w:r>
+          </w:p>
+        </w:tc>
+      </w:tr>
+      <w:tr>
+        <w:tc>
+          <w:tcPr>
+            <w:tcW w:type="dxa" w:w="5040"/>
+          </w:tcPr>
+          <w:p>
+            <w:pPr>
+              <w:spacing w:after="100"/>
+            </w:pPr>
+            <w:r>
+              <w:rPr>
+                <w:sz w:val="20"/>
+              </w:rPr>
+              <w:t>Threshold</w:t>
+            </w:r>
+          </w:p>
+        </w:tc>
+        <w:tc>
+          <w:tcPr>
+            <w:tcW w:type="dxa" w:w="5040"/>
+          </w:tcPr>
+          <w:p>
+            <w:pPr>
+              <w:spacing w:after="100"/>
+            </w:pPr>
+            <w:r>
+              <w:rPr>
+                <w:sz w:val="20"/>
+              </w:rPr>
+              <w:t>Choose a black and white cutoff for a stencil effect.</w:t>
+            </w:r>
+          </w:p>
+        </w:tc>
+      </w:tr>
+      <w:tr>
+        <w:tc>
+          <w:tcPr>
+            <w:tcW w:type="dxa" w:w="5040"/>
+          </w:tcPr>
+          <w:p>
+            <w:pPr>
+              <w:spacing w:after="100"/>
+            </w:pPr>
+            <w:r>
+              <w:rPr>
+                <w:sz w:val="20"/>
+              </w:rPr>
+              <w:t>Split toning</w:t>
+            </w:r>
+          </w:p>
+        </w:tc>
+        <w:tc>
+          <w:tcPr>
+            <w:tcW w:type="dxa" w:w="5040"/>
+          </w:tcPr>
+          <w:p>
+            <w:pPr>
+              <w:spacing w:after="100"/>
+            </w:pPr>
+            <w:r>
+              <w:rPr>
+                <w:sz w:val="20"/>
+              </w:rPr>
+              <w:t>Add cool shadows and warm highlights.</w:t>
+            </w:r>
+          </w:p>
+        </w:tc>
+      </w:tr>
+      <w:tr>
+        <w:tc>
+          <w:tcPr>
+            <w:tcW w:type="dxa" w:w="5040"/>
+          </w:tcPr>
+          <w:p>
+            <w:pPr>
+              <w:spacing w:after="100"/>
+            </w:pPr>
+            <w:r>
+              <w:rPr>
+                <w:sz w:val="20"/>
+              </w:rPr>
+              <w:t>RGB balance</w:t>
+            </w:r>
+          </w:p>
+        </w:tc>
+        <w:tc>
+          <w:tcPr>
+            <w:tcW w:type="dxa" w:w="5040"/>
+          </w:tcPr>
+          <w:p>
+            <w:pPr>
+              <w:spacing w:after="100"/>
+            </w:pPr>
+            <w:r>
+              <w:rPr>
+                <w:sz w:val="20"/>
+              </w:rPr>
+              <w:t>Change red, green and blue strength independently.</w:t>
+            </w:r>
+          </w:p>
+        </w:tc>
+      </w:tr>
+    </w:tbl>
+    <w:p>
+      <w:pPr>
+        <w:pStyle w:val="Heading2"/>
+      </w:pPr>
+      <w:r>
+        <w:t>A simple portrait treatment</w:t>
+      </w:r>
+    </w:p>
+    <w:p>
+      <w:r>
+        <w:t>Start with Matte fade around 20 percent. Add Split toning around 15 to 25 percent, then a little Film grain. Compare with the original and adjust to taste. Save the adjustments as a look if you want to reuse them. Export a separate PNG or JPEG copy.</w:t>
+      </w:r>
+    </w:p>
+    <w:p>
+      <w:pPr>
+        <w:pStyle w:val="Heading2"/>
+      </w:pPr>
+      <w:r>
+        <w:t>What has been checked</w:t>
+      </w:r>
+    </w:p>
+    <w:p>
+      <w:r>
+        <w:t>129 shared Android and 130 RN-native JVM tests pass, alongside 60 React Native tests, TypeScript and lint. The complete ARM64 internal APK passes source, package, signature and alignment checks. Integration tests compiled; they have not run on a phone.</w:t>
+      </w:r>
+    </w:p>
+    <w:p>
+      <w:r>
+        <w:t>The tools support undo and redo, old saved looks, lifecycle recovery and the same preview and export path. Extra provenance protection prevents a future creation workspace from saving over one of its imported originals through an alias.</w:t>
+      </w:r>
+    </w:p>
+    <w:p>
+      <w:pPr>
+        <w:pStyle w:val="Heading2"/>
+      </w:pPr>
+      <w:r>
+        <w:t>What this does not complete</w:t>
+      </w:r>
+    </w:p>
+    <w:p>
+      <w:r>
+        <w:t>This is eight editing tools in one workflow and zero new AI engines. The 90-feature roadmap, genuine generation, photo rigging, iOS native editors and physical acceptance remain unfinished. The earlier iOS simulator shell passed CI; it is not an installable iPhone release.</w:t>
       </w:r>
     </w:p>
     <w:sectPr>

</xml_diff>

<commit_message>
Add twenty photo effects and video batch tools with verified APK
</commit_message>
<xml_diff>
--- a/docs/releases/Honorable-Creative-Guide.docx
+++ b/docs/releases/Honorable-Creative-Guide.docx
@@ -2204,7 +2204,7 @@
           </w:tcPr>
           <w:p>
             <w:r>
-              <w:t>130 passed freshly.</w:t>
+              <w:t>144 passed freshly.</w:t>
             </w:r>
           </w:p>
         </w:tc>
@@ -2235,7 +2235,7 @@
           </w:tcPr>
           <w:p>
             <w:r>
-              <w:t>129 passed freshly, including the new creative and provenance checks.</w:t>
+              <w:t>147 passed freshly, including the new effect, color and provenance checks.</w:t>
             </w:r>
           </w:p>
         </w:tc>
@@ -2462,7 +2462,7 @@
         <w:br/>
         <w:t>Preview: docs/ui/Honorable-current-preview.html</w:t>
         <w:br/>
-        <w:t>Build notes: docs/CREATIVE_COLOR_READINESS.md and docs/HOME_STUDIOS_READINESS.md</w:t>
+        <w:t>Latest build notes: docs/CREATIVE20_READINESS.md; earlier evidence stays in the prior checkpoints.</w:t>
       </w:r>
     </w:p>
     <w:p>
@@ -2891,7 +2891,7 @@
         <w:pStyle w:val="Heading2"/>
       </w:pPr>
       <w:r>
-        <w:t>What has been checked</w:t>
+        <w:t>Earlier creative color verification</w:t>
       </w:r>
     </w:p>
     <w:p>
@@ -2915,6 +2915,931 @@
     <w:p>
       <w:r>
         <w:t>This is eight editing tools in one workflow and zero new AI engines. The 90-feature roadmap, genuine generation, photo rigging, iOS native editors and physical acceptance remain unfinished. The earlier iOS simulator shell passed CI; it is not an installable iPhone release.</w:t>
+      </w:r>
+    </w:p>
+    <w:p>
+      <w:r>
+        <w:br w:type="page"/>
+      </w:r>
+    </w:p>
+    <w:p>
+      <w:pPr>
+        <w:pStyle w:val="Heading1"/>
+      </w:pPr>
+      <w:r>
+        <w:t>Twelve new photo effects</w:t>
+      </w:r>
+    </w:p>
+    <w:p>
+      <w:r>
+        <w:t>This batch adds twelve local effects to the existing photo editor. Open Tools, choose Photo effects, adjust a tool and Apply. Cancel leaves the image unchanged.</w:t>
+      </w:r>
+    </w:p>
+    <w:tbl>
+      <w:tblPr>
+        <w:tblStyle w:val="TableGrid"/>
+        <w:tblW w:type="auto" w:w="0"/>
+        <w:tblLook w:firstColumn="1" w:firstRow="1" w:lastColumn="0" w:lastRow="0" w:noHBand="0" w:noVBand="1" w:val="04A0"/>
+      </w:tblPr>
+      <w:tblGrid>
+        <w:gridCol w:w="5040"/>
+        <w:gridCol w:w="5040"/>
+      </w:tblGrid>
+      <w:tr>
+        <w:tc>
+          <w:tcPr>
+            <w:tcW w:type="dxa" w:w="5040"/>
+          </w:tcPr>
+          <w:p>
+            <w:pPr>
+              <w:spacing w:after="100"/>
+            </w:pPr>
+            <w:r>
+              <w:rPr>
+                <w:sz w:val="20"/>
+              </w:rPr>
+              <w:t>Tool</w:t>
+            </w:r>
+          </w:p>
+        </w:tc>
+        <w:tc>
+          <w:tcPr>
+            <w:tcW w:type="dxa" w:w="5040"/>
+          </w:tcPr>
+          <w:p>
+            <w:pPr>
+              <w:spacing w:after="100"/>
+            </w:pPr>
+            <w:r>
+              <w:rPr>
+                <w:sz w:val="20"/>
+              </w:rPr>
+              <w:t>What it does</w:t>
+            </w:r>
+          </w:p>
+        </w:tc>
+      </w:tr>
+      <w:tr>
+        <w:tc>
+          <w:tcPr>
+            <w:tcW w:type="dxa" w:w="5040"/>
+          </w:tcPr>
+          <w:p>
+            <w:pPr>
+              <w:spacing w:after="100"/>
+            </w:pPr>
+            <w:r>
+              <w:rPr>
+                <w:sz w:val="20"/>
+              </w:rPr>
+              <w:t>Negative</w:t>
+            </w:r>
+          </w:p>
+        </w:tc>
+        <w:tc>
+          <w:tcPr>
+            <w:tcW w:type="dxa" w:w="5040"/>
+          </w:tcPr>
+          <w:p>
+            <w:pPr>
+              <w:spacing w:after="100"/>
+            </w:pPr>
+            <w:r>
+              <w:rPr>
+                <w:sz w:val="20"/>
+              </w:rPr>
+              <w:t>Invert the picture colors.</w:t>
+            </w:r>
+          </w:p>
+        </w:tc>
+      </w:tr>
+      <w:tr>
+        <w:tc>
+          <w:tcPr>
+            <w:tcW w:type="dxa" w:w="5040"/>
+          </w:tcPr>
+          <w:p>
+            <w:pPr>
+              <w:spacing w:after="100"/>
+            </w:pPr>
+            <w:r>
+              <w:rPr>
+                <w:sz w:val="20"/>
+              </w:rPr>
+              <w:t>Solarize</w:t>
+            </w:r>
+          </w:p>
+        </w:tc>
+        <w:tc>
+          <w:tcPr>
+            <w:tcW w:type="dxa" w:w="5040"/>
+          </w:tcPr>
+          <w:p>
+            <w:pPr>
+              <w:spacing w:after="100"/>
+            </w:pPr>
+            <w:r>
+              <w:rPr>
+                <w:sz w:val="20"/>
+              </w:rPr>
+              <w:t>Invert channels above your chosen cutoff.</w:t>
+            </w:r>
+          </w:p>
+        </w:tc>
+      </w:tr>
+      <w:tr>
+        <w:tc>
+          <w:tcPr>
+            <w:tcW w:type="dxa" w:w="5040"/>
+          </w:tcPr>
+          <w:p>
+            <w:pPr>
+              <w:spacing w:after="100"/>
+            </w:pPr>
+            <w:r>
+              <w:rPr>
+                <w:sz w:val="20"/>
+              </w:rPr>
+              <w:t>Sepia</w:t>
+            </w:r>
+          </w:p>
+        </w:tc>
+        <w:tc>
+          <w:tcPr>
+            <w:tcW w:type="dxa" w:w="5040"/>
+          </w:tcPr>
+          <w:p>
+            <w:pPr>
+              <w:spacing w:after="100"/>
+            </w:pPr>
+            <w:r>
+              <w:rPr>
+                <w:sz w:val="20"/>
+              </w:rPr>
+              <w:t>Mix in a warm monochrome treatment.</w:t>
+            </w:r>
+          </w:p>
+        </w:tc>
+      </w:tr>
+      <w:tr>
+        <w:tc>
+          <w:tcPr>
+            <w:tcW w:type="dxa" w:w="5040"/>
+          </w:tcPr>
+          <w:p>
+            <w:pPr>
+              <w:spacing w:after="100"/>
+            </w:pPr>
+            <w:r>
+              <w:rPr>
+                <w:sz w:val="20"/>
+              </w:rPr>
+              <w:t>Duotone</w:t>
+            </w:r>
+          </w:p>
+        </w:tc>
+        <w:tc>
+          <w:tcPr>
+            <w:tcW w:type="dxa" w:w="5040"/>
+          </w:tcPr>
+          <w:p>
+            <w:pPr>
+              <w:spacing w:after="100"/>
+            </w:pPr>
+            <w:r>
+              <w:rPr>
+                <w:sz w:val="20"/>
+              </w:rPr>
+              <w:t>Map tones between two colors you can choose.</w:t>
+            </w:r>
+          </w:p>
+        </w:tc>
+      </w:tr>
+      <w:tr>
+        <w:tc>
+          <w:tcPr>
+            <w:tcW w:type="dxa" w:w="5040"/>
+          </w:tcPr>
+          <w:p>
+            <w:pPr>
+              <w:spacing w:after="100"/>
+            </w:pPr>
+            <w:r>
+              <w:rPr>
+                <w:sz w:val="20"/>
+              </w:rPr>
+              <w:t>Gamma</w:t>
+            </w:r>
+          </w:p>
+        </w:tc>
+        <w:tc>
+          <w:tcPr>
+            <w:tcW w:type="dxa" w:w="5040"/>
+          </w:tcPr>
+          <w:p>
+            <w:pPr>
+              <w:spacing w:after="100"/>
+            </w:pPr>
+            <w:r>
+              <w:rPr>
+                <w:sz w:val="20"/>
+              </w:rPr>
+              <w:t>Adjust midtones with a nonlinear curve.</w:t>
+            </w:r>
+          </w:p>
+        </w:tc>
+      </w:tr>
+      <w:tr>
+        <w:tc>
+          <w:tcPr>
+            <w:tcW w:type="dxa" w:w="5040"/>
+          </w:tcPr>
+          <w:p>
+            <w:pPr>
+              <w:spacing w:after="100"/>
+            </w:pPr>
+            <w:r>
+              <w:rPr>
+                <w:sz w:val="20"/>
+              </w:rPr>
+              <w:t>Pixelate</w:t>
+            </w:r>
+          </w:p>
+        </w:tc>
+        <w:tc>
+          <w:tcPr>
+            <w:tcW w:type="dxa" w:w="5040"/>
+          </w:tcPr>
+          <w:p>
+            <w:pPr>
+              <w:spacing w:after="100"/>
+            </w:pPr>
+            <w:r>
+              <w:rPr>
+                <w:sz w:val="20"/>
+              </w:rPr>
+              <w:t>Average colors into adjustable blocks.</w:t>
+            </w:r>
+          </w:p>
+        </w:tc>
+      </w:tr>
+      <w:tr>
+        <w:tc>
+          <w:tcPr>
+            <w:tcW w:type="dxa" w:w="5040"/>
+          </w:tcPr>
+          <w:p>
+            <w:pPr>
+              <w:spacing w:after="100"/>
+            </w:pPr>
+            <w:r>
+              <w:rPr>
+                <w:sz w:val="20"/>
+              </w:rPr>
+              <w:t>Soft blur</w:t>
+            </w:r>
+          </w:p>
+        </w:tc>
+        <w:tc>
+          <w:tcPr>
+            <w:tcW w:type="dxa" w:w="5040"/>
+          </w:tcPr>
+          <w:p>
+            <w:pPr>
+              <w:spacing w:after="100"/>
+            </w:pPr>
+            <w:r>
+              <w:rPr>
+                <w:sz w:val="20"/>
+              </w:rPr>
+              <w:t>Smooth the picture with an adjustable box blur.</w:t>
+            </w:r>
+          </w:p>
+        </w:tc>
+      </w:tr>
+      <w:tr>
+        <w:tc>
+          <w:tcPr>
+            <w:tcW w:type="dxa" w:w="5040"/>
+          </w:tcPr>
+          <w:p>
+            <w:pPr>
+              <w:spacing w:after="100"/>
+            </w:pPr>
+            <w:r>
+              <w:rPr>
+                <w:sz w:val="20"/>
+              </w:rPr>
+              <w:t>Edge outline</w:t>
+            </w:r>
+          </w:p>
+        </w:tc>
+        <w:tc>
+          <w:tcPr>
+            <w:tcW w:type="dxa" w:w="5040"/>
+          </w:tcPr>
+          <w:p>
+            <w:pPr>
+              <w:spacing w:after="100"/>
+            </w:pPr>
+            <w:r>
+              <w:rPr>
+                <w:sz w:val="20"/>
+              </w:rPr>
+              <w:t>Find contrast edges for a graphic treatment.</w:t>
+            </w:r>
+          </w:p>
+        </w:tc>
+      </w:tr>
+      <w:tr>
+        <w:tc>
+          <w:tcPr>
+            <w:tcW w:type="dxa" w:w="5040"/>
+          </w:tcPr>
+          <w:p>
+            <w:pPr>
+              <w:spacing w:after="100"/>
+            </w:pPr>
+            <w:r>
+              <w:rPr>
+                <w:sz w:val="20"/>
+              </w:rPr>
+              <w:t>Emboss</w:t>
+            </w:r>
+          </w:p>
+        </w:tc>
+        <w:tc>
+          <w:tcPr>
+            <w:tcW w:type="dxa" w:w="5040"/>
+          </w:tcPr>
+          <w:p>
+            <w:pPr>
+              <w:spacing w:after="100"/>
+            </w:pPr>
+            <w:r>
+              <w:rPr>
+                <w:sz w:val="20"/>
+              </w:rPr>
+              <w:t>Turn directional contrast into a raised-surface look.</w:t>
+            </w:r>
+          </w:p>
+        </w:tc>
+      </w:tr>
+      <w:tr>
+        <w:tc>
+          <w:tcPr>
+            <w:tcW w:type="dxa" w:w="5040"/>
+          </w:tcPr>
+          <w:p>
+            <w:pPr>
+              <w:spacing w:after="100"/>
+            </w:pPr>
+            <w:r>
+              <w:rPr>
+                <w:sz w:val="20"/>
+              </w:rPr>
+              <w:t>Chromatic offset</w:t>
+            </w:r>
+          </w:p>
+        </w:tc>
+        <w:tc>
+          <w:tcPr>
+            <w:tcW w:type="dxa" w:w="5040"/>
+          </w:tcPr>
+          <w:p>
+            <w:pPr>
+              <w:spacing w:after="100"/>
+            </w:pPr>
+            <w:r>
+              <w:rPr>
+                <w:sz w:val="20"/>
+              </w:rPr>
+              <w:t>Separate red and blue samples horizontally.</w:t>
+            </w:r>
+          </w:p>
+        </w:tc>
+      </w:tr>
+      <w:tr>
+        <w:tc>
+          <w:tcPr>
+            <w:tcW w:type="dxa" w:w="5040"/>
+          </w:tcPr>
+          <w:p>
+            <w:pPr>
+              <w:spacing w:after="100"/>
+            </w:pPr>
+            <w:r>
+              <w:rPr>
+                <w:sz w:val="20"/>
+              </w:rPr>
+              <w:t>Halftone dots</w:t>
+            </w:r>
+          </w:p>
+        </w:tc>
+        <w:tc>
+          <w:tcPr>
+            <w:tcW w:type="dxa" w:w="5040"/>
+          </w:tcPr>
+          <w:p>
+            <w:pPr>
+              <w:spacing w:after="100"/>
+            </w:pPr>
+            <w:r>
+              <w:rPr>
+                <w:sz w:val="20"/>
+              </w:rPr>
+              <w:t>Represent tone as black dots on white.</w:t>
+            </w:r>
+          </w:p>
+        </w:tc>
+      </w:tr>
+      <w:tr>
+        <w:tc>
+          <w:tcPr>
+            <w:tcW w:type="dxa" w:w="5040"/>
+          </w:tcPr>
+          <w:p>
+            <w:pPr>
+              <w:spacing w:after="100"/>
+            </w:pPr>
+            <w:r>
+              <w:rPr>
+                <w:sz w:val="20"/>
+              </w:rPr>
+              <w:t>Scanlines</w:t>
+            </w:r>
+          </w:p>
+        </w:tc>
+        <w:tc>
+          <w:tcPr>
+            <w:tcW w:type="dxa" w:w="5040"/>
+          </w:tcPr>
+          <w:p>
+            <w:pPr>
+              <w:spacing w:after="100"/>
+            </w:pPr>
+            <w:r>
+              <w:rPr>
+                <w:sz w:val="20"/>
+              </w:rPr>
+              <w:t>Add alternating dark bands with adjustable strength.</w:t>
+            </w:r>
+          </w:p>
+        </w:tc>
+      </w:tr>
+    </w:tbl>
+    <w:p>
+      <w:pPr>
+        <w:pStyle w:val="Heading2"/>
+      </w:pPr>
+      <w:r>
+        <w:t>Keep the editing workflow you know</w:t>
+      </w:r>
+    </w:p>
+    <w:p>
+      <w:r>
+        <w:t>Each tool uses the existing preview and copy-export renderer. Undo, redo, compare and reset work through the same edit state. Saved looks include the effects, and earlier saved looks still load. Framing, person treatment and text stay with the target photo.</w:t>
+      </w:r>
+    </w:p>
+    <w:p>
+      <w:r>
+        <w:t>Effects preserve the alpha at each output position. Original files stay unchanged. Pixelation is a creative effect; it is not secure redaction. These tools do not generate subjects or replace missing detail.</w:t>
+      </w:r>
+    </w:p>
+    <w:p>
+      <w:r>
+        <w:br w:type="page"/>
+      </w:r>
+    </w:p>
+    <w:p>
+      <w:pPr>
+        <w:pStyle w:val="Heading1"/>
+      </w:pPr>
+      <w:r>
+        <w:t>Photo effect examples</w:t>
+      </w:r>
+    </w:p>
+    <w:p>
+      <w:r>
+        <w:t>These examples call the actual compiled Kotlin kernel used by the new effect stage.</w:t>
+      </w:r>
+    </w:p>
+    <w:p>
+      <w:pPr>
+        <w:jc w:val="center"/>
+      </w:pPr>
+      <w:r>
+        <w:drawing>
+          <wp:inline xmlns:a="http://schemas.openxmlformats.org/drawingml/2006/main" xmlns:pic="http://schemas.openxmlformats.org/drawingml/2006/picture">
+            <wp:extent cx="5852160" cy="7315200"/>
+            <wp:docPr id="15" name="Picture 15"/>
+            <wp:cNvGraphicFramePr>
+              <a:graphicFrameLocks noChangeAspect="1"/>
+            </wp:cNvGraphicFramePr>
+            <a:graphic>
+              <a:graphicData uri="http://schemas.openxmlformats.org/drawingml/2006/picture">
+                <pic:pic>
+                  <pic:nvPicPr>
+                    <pic:cNvPr id="0" name="creative20-photo-examples.png"/>
+                    <pic:cNvPicPr/>
+                  </pic:nvPicPr>
+                  <pic:blipFill>
+                    <a:blip r:embed="rId23"/>
+                    <a:stretch>
+                      <a:fillRect/>
+                    </a:stretch>
+                  </pic:blipFill>
+                  <pic:spPr>
+                    <a:xfrm>
+                      <a:off x="0" y="0"/>
+                      <a:ext cx="5852160" cy="7315200"/>
+                    </a:xfrm>
+                    <a:prstGeom prst="rect"/>
+                  </pic:spPr>
+                </pic:pic>
+              </a:graphicData>
+            </a:graphic>
+          </wp:inline>
+        </w:drawing>
+      </w:r>
+    </w:p>
+    <w:p>
+      <w:pPr>
+        <w:pStyle w:val="Caption"/>
+      </w:pPr>
+      <w:r>
+        <w:t>Credited public-domain Mona Lisa reference, processed at illustrative strengths. Algorithm examples, not phone screenshots or AI-generated art.</w:t>
+      </w:r>
+    </w:p>
+    <w:p>
+      <w:r>
+        <w:br w:type="page"/>
+      </w:r>
+    </w:p>
+    <w:p>
+      <w:pPr>
+        <w:pStyle w:val="Heading1"/>
+      </w:pPr>
+      <w:r>
+        <w:t>Eight video batch workflows</w:t>
+      </w:r>
+    </w:p>
+    <w:p>
+      <w:r>
+        <w:t>Choose Batch editing in the Project tools or inspector. Review the proposed change, then Apply and preview. Each operation is one undoable edit.</w:t>
+      </w:r>
+    </w:p>
+    <w:tbl>
+      <w:tblPr>
+        <w:tblStyle w:val="TableGrid"/>
+        <w:tblW w:type="auto" w:w="0"/>
+        <w:tblLook w:firstColumn="1" w:firstRow="1" w:lastColumn="0" w:lastRow="0" w:noHBand="0" w:noVBand="1" w:val="04A0"/>
+      </w:tblPr>
+      <w:tblGrid>
+        <w:gridCol w:w="5040"/>
+        <w:gridCol w:w="5040"/>
+      </w:tblGrid>
+      <w:tr>
+        <w:tc>
+          <w:tcPr>
+            <w:tcW w:type="dxa" w:w="5040"/>
+          </w:tcPr>
+          <w:p>
+            <w:pPr>
+              <w:spacing w:after="100"/>
+            </w:pPr>
+            <w:r>
+              <w:rPr>
+                <w:sz w:val="20"/>
+              </w:rPr>
+              <w:t>Tool</w:t>
+            </w:r>
+          </w:p>
+        </w:tc>
+        <w:tc>
+          <w:tcPr>
+            <w:tcW w:type="dxa" w:w="5040"/>
+          </w:tcPr>
+          <w:p>
+            <w:pPr>
+              <w:spacing w:after="100"/>
+            </w:pPr>
+            <w:r>
+              <w:rPr>
+                <w:sz w:val="20"/>
+              </w:rPr>
+              <w:t>What it does</w:t>
+            </w:r>
+          </w:p>
+        </w:tc>
+      </w:tr>
+      <w:tr>
+        <w:tc>
+          <w:tcPr>
+            <w:tcW w:type="dxa" w:w="5040"/>
+          </w:tcPr>
+          <w:p>
+            <w:pPr>
+              <w:spacing w:after="100"/>
+            </w:pPr>
+            <w:r>
+              <w:rPr>
+                <w:sz w:val="20"/>
+              </w:rPr>
+              <w:t>Divide clip evenly</w:t>
+            </w:r>
+          </w:p>
+        </w:tc>
+        <w:tc>
+          <w:tcPr>
+            <w:tcW w:type="dxa" w:w="5040"/>
+          </w:tcPr>
+          <w:p>
+            <w:pPr>
+              <w:spacing w:after="100"/>
+            </w:pPr>
+            <w:r>
+              <w:rPr>
+                <w:sz w:val="20"/>
+              </w:rPr>
+              <w:t>Split the selected clip into equal source ranges.</w:t>
+            </w:r>
+          </w:p>
+        </w:tc>
+      </w:tr>
+      <w:tr>
+        <w:tc>
+          <w:tcPr>
+            <w:tcW w:type="dxa" w:w="5040"/>
+          </w:tcPr>
+          <w:p>
+            <w:pPr>
+              <w:spacing w:after="100"/>
+            </w:pPr>
+            <w:r>
+              <w:rPr>
+                <w:sz w:val="20"/>
+              </w:rPr>
+              <w:t>Limit clip lengths</w:t>
+            </w:r>
+          </w:p>
+        </w:tc>
+        <w:tc>
+          <w:tcPr>
+            <w:tcW w:type="dxa" w:w="5040"/>
+          </w:tcPr>
+          <w:p>
+            <w:pPr>
+              <w:spacing w:after="100"/>
+            </w:pPr>
+            <w:r>
+              <w:rPr>
+                <w:sz w:val="20"/>
+              </w:rPr>
+              <w:t>Keep centered excerpts up to a chosen playback length.</w:t>
+            </w:r>
+          </w:p>
+        </w:tc>
+      </w:tr>
+      <w:tr>
+        <w:tc>
+          <w:tcPr>
+            <w:tcW w:type="dxa" w:w="5040"/>
+          </w:tcPr>
+          <w:p>
+            <w:pPr>
+              <w:spacing w:after="100"/>
+            </w:pPr>
+            <w:r>
+              <w:rPr>
+                <w:sz w:val="20"/>
+              </w:rPr>
+              <w:t>Reverse clip order</w:t>
+            </w:r>
+          </w:p>
+        </w:tc>
+        <w:tc>
+          <w:tcPr>
+            <w:tcW w:type="dxa" w:w="5040"/>
+          </w:tcPr>
+          <w:p>
+            <w:pPr>
+              <w:spacing w:after="100"/>
+            </w:pPr>
+            <w:r>
+              <w:rPr>
+                <w:sz w:val="20"/>
+              </w:rPr>
+              <w:t>Reverse the sequence; footage still plays forward.</w:t>
+            </w:r>
+          </w:p>
+        </w:tc>
+      </w:tr>
+      <w:tr>
+        <w:tc>
+          <w:tcPr>
+            <w:tcW w:type="dxa" w:w="5040"/>
+          </w:tcPr>
+          <w:p>
+            <w:pPr>
+              <w:spacing w:after="100"/>
+            </w:pPr>
+            <w:r>
+              <w:rPr>
+                <w:sz w:val="20"/>
+              </w:rPr>
+              <w:t>Shuffle clip order</w:t>
+            </w:r>
+          </w:p>
+        </w:tc>
+        <w:tc>
+          <w:tcPr>
+            <w:tcW w:type="dxa" w:w="5040"/>
+          </w:tcPr>
+          <w:p>
+            <w:pPr>
+              <w:spacing w:after="100"/>
+            </w:pPr>
+            <w:r>
+              <w:rPr>
+                <w:sz w:val="20"/>
+              </w:rPr>
+              <w:t>Review a new order without adding or losing clips.</w:t>
+            </w:r>
+          </w:p>
+        </w:tc>
+      </w:tr>
+      <w:tr>
+        <w:tc>
+          <w:tcPr>
+            <w:tcW w:type="dxa" w:w="5040"/>
+          </w:tcPr>
+          <w:p>
+            <w:pPr>
+              <w:spacing w:after="100"/>
+            </w:pPr>
+            <w:r>
+              <w:rPr>
+                <w:sz w:val="20"/>
+              </w:rPr>
+              <w:t>Repeat sequence</w:t>
+            </w:r>
+          </w:p>
+        </w:tc>
+        <w:tc>
+          <w:tcPr>
+            <w:tcW w:type="dxa" w:w="5040"/>
+          </w:tcPr>
+          <w:p>
+            <w:pPr>
+              <w:spacing w:after="100"/>
+            </w:pPr>
+            <w:r>
+              <w:rPr>
+                <w:sz w:val="20"/>
+              </w:rPr>
+              <w:t>Repeat the whole edited sequence two to four times.</w:t>
+            </w:r>
+          </w:p>
+        </w:tc>
+      </w:tr>
+      <w:tr>
+        <w:tc>
+          <w:tcPr>
+            <w:tcW w:type="dxa" w:w="5040"/>
+          </w:tcPr>
+          <w:p>
+            <w:pPr>
+              <w:spacing w:after="100"/>
+            </w:pPr>
+            <w:r>
+              <w:rPr>
+                <w:sz w:val="20"/>
+              </w:rPr>
+              <w:t>Set all clip speeds</w:t>
+            </w:r>
+          </w:p>
+        </w:tc>
+        <w:tc>
+          <w:tcPr>
+            <w:tcW w:type="dxa" w:w="5040"/>
+          </w:tcPr>
+          <w:p>
+            <w:pPr>
+              <w:spacing w:after="100"/>
+            </w:pPr>
+            <w:r>
+              <w:rPr>
+                <w:sz w:val="20"/>
+              </w:rPr>
+              <w:t>Apply one supported speed across every clip.</w:t>
+            </w:r>
+          </w:p>
+        </w:tc>
+      </w:tr>
+      <w:tr>
+        <w:tc>
+          <w:tcPr>
+            <w:tcW w:type="dxa" w:w="5040"/>
+          </w:tcPr>
+          <w:p>
+            <w:pPr>
+              <w:spacing w:after="100"/>
+            </w:pPr>
+            <w:r>
+              <w:rPr>
+                <w:sz w:val="20"/>
+              </w:rPr>
+              <w:t>Shift caption timing</w:t>
+            </w:r>
+          </w:p>
+        </w:tc>
+        <w:tc>
+          <w:tcPr>
+            <w:tcW w:type="dxa" w:w="5040"/>
+          </w:tcPr>
+          <w:p>
+            <w:pPr>
+              <w:spacing w:after="100"/>
+            </w:pPr>
+            <w:r>
+              <w:rPr>
+                <w:sz w:val="20"/>
+              </w:rPr>
+              <w:t>Move the selected captions by a source-time offset.</w:t>
+            </w:r>
+          </w:p>
+        </w:tc>
+      </w:tr>
+      <w:tr>
+        <w:tc>
+          <w:tcPr>
+            <w:tcW w:type="dxa" w:w="5040"/>
+          </w:tcPr>
+          <w:p>
+            <w:pPr>
+              <w:spacing w:after="100"/>
+            </w:pPr>
+            <w:r>
+              <w:rPr>
+                <w:sz w:val="20"/>
+              </w:rPr>
+              <w:t>Reflow caption lines</w:t>
+            </w:r>
+          </w:p>
+        </w:tc>
+        <w:tc>
+          <w:tcPr>
+            <w:tcW w:type="dxa" w:w="5040"/>
+          </w:tcPr>
+          <w:p>
+            <w:pPr>
+              <w:spacing w:after="100"/>
+            </w:pPr>
+            <w:r>
+              <w:rPr>
+                <w:sz w:val="20"/>
+              </w:rPr>
+              <w:t>Rewrap caption text without changing timing or removing words.</w:t>
+            </w:r>
+          </w:p>
+        </w:tc>
+      </w:tr>
+    </w:tbl>
+    <w:p>
+      <w:pPr>
+        <w:pStyle w:val="Heading2"/>
+      </w:pPr>
+      <w:r>
+        <w:t>Review before committing</w:t>
+      </w:r>
+    </w:p>
+    <w:p>
+      <w:r>
+        <w:t>The review states the new clip count and duration. Existing soundtrack, source references and clip styling use the same project model. Captions outside a centered trim are removed. Timing shifts that leave the selected clip are refused. Text that cannot fit three lines is rejected rather than truncated. Existing project limits still apply.</w:t>
+      </w:r>
+    </w:p>
+    <w:p>
+      <w:pPr>
+        <w:pStyle w:val="Heading2"/>
+      </w:pPr>
+      <w:r>
+        <w:t>Build and acceptance</w:t>
+      </w:r>
+    </w:p>
+    <w:p>
+      <w:r>
+        <w:t>144 RN-native and 147 shared Android JVM cases pass, including 32 new regressions. All 60 React Native tests, TypeScript and lint pass. Three new integration cases compile; they have not run on a phone. One final integrated ARM64 APK passes source, package, model, signature and alignment checks.</w:t>
+      </w:r>
+    </w:p>
+    <w:p>
+      <w:r>
+        <w:t>Initial validation caught an invalid recovery test fixture whose trim range exceeded its selected clip. The fixture was corrected; production validation stayed strict. The final batch passed. Physical Android use, native iOS editors and real generation or rigging remain unfinished.</w:t>
+      </w:r>
+    </w:p>
+    <w:p>
+      <w:r>
+        <w:t>Count: twenty additions in this batch, comprising twelve photo-effect tools and eight video workflows. Parameter choices, buttons, tests and fixes are not extra features. No new AI engine is claimed.</w:t>
       </w:r>
     </w:p>
     <w:sectPr>

</xml_diff>